<commit_message>
Buch 4 + Journal lektoriert, Journal-Cover gebaut
</commit_message>
<xml_diff>
--- a/outputs/buch-an-mich-denken/buch4-Journal-MANUSKRIPT.docx
+++ b/outputs/buch-an-mich-denken/buch4-Journal-MANUSKRIPT.docx
@@ -261,7 +261,7 @@
           <w:b/>
           <w:color w:val="B9727E"/>
         </w:rPr>
-        <w:t>Schweiz  143</w:t>
+        <w:t>Schweiz 143</w:t>
       </w:r>
     </w:p>
     <w:p>
@@ -275,7 +275,7 @@
           <w:b/>
           <w:color w:val="B9727E"/>
         </w:rPr>
-        <w:t>Deutschland  0800 111 0 111</w:t>
+        <w:t>Deutschland 0800 111 0 111</w:t>
       </w:r>
     </w:p>
     <w:p>
@@ -289,7 +289,7 @@
           <w:b/>
           <w:color w:val="B9727E"/>
         </w:rPr>
-        <w:t>Österreich  142</w:t>
+        <w:t>Österreich 142</w:t>
       </w:r>
     </w:p>
     <w:p>
@@ -330,7 +330,7 @@
           <w:color w:val="C4A05A"/>
           <w:sz w:val="40"/>
         </w:rPr>
-        <w:t xml:space="preserve">1  </w:t>
+        <w:t xml:space="preserve">1 </w:t>
       </w:r>
       <w:r>
         <w:rPr>
@@ -372,7 +372,7 @@
           <w:color w:val="C4A05A"/>
           <w:sz w:val="40"/>
         </w:rPr>
-        <w:t xml:space="preserve">2  </w:t>
+        <w:t xml:space="preserve">2 </w:t>
       </w:r>
       <w:r>
         <w:rPr>
@@ -414,7 +414,7 @@
           <w:color w:val="C4A05A"/>
           <w:sz w:val="40"/>
         </w:rPr>
-        <w:t xml:space="preserve">3  </w:t>
+        <w:t xml:space="preserve">3 </w:t>
       </w:r>
       <w:r>
         <w:rPr>
@@ -494,7 +494,7 @@
         <w:rPr>
           <w:sz w:val="21"/>
         </w:rPr>
-        <w:t>☐  Ich spüre zuerst, was andere brauchen — und erst spät, was ich brauche.</w:t>
+        <w:t>☐ Ich spüre zuerst, was andere brauchen — und erst spät, was ich brauche.</w:t>
       </w:r>
     </w:p>
     <w:p>
@@ -507,7 +507,7 @@
         <w:rPr>
           <w:sz w:val="21"/>
         </w:rPr>
-        <w:t>☐  „Ich möchte das“ auszusprechen fällt mir schwer, ohne es zu rechtfertigen.</w:t>
+        <w:t>☐ „Ich möchte das“ auszusprechen fällt mir schwer, ohne es zu rechtfertigen.</w:t>
       </w:r>
     </w:p>
     <w:p>
@@ -520,7 +520,7 @@
         <w:rPr>
           <w:sz w:val="21"/>
         </w:rPr>
-        <w:t>☐  Meine To-do-Liste wird nie leer, egal wie viel ich abarbeite.</w:t>
+        <w:t>☐ Meine To-do-Liste wird nie leer, egal wie viel ich abarbeite.</w:t>
       </w:r>
     </w:p>
     <w:p>
@@ -533,7 +533,7 @@
         <w:rPr>
           <w:sz w:val="21"/>
         </w:rPr>
-        <w:t>☐  Ich habe Angst, überflüssig zu werden, wenn ich aufhöre zu geben.</w:t>
+        <w:t>☐ Ich habe Angst, überflüssig zu werden, wenn ich aufhöre zu geben.</w:t>
       </w:r>
     </w:p>
     <w:p>
@@ -546,7 +546,7 @@
         <w:rPr>
           <w:sz w:val="21"/>
         </w:rPr>
-        <w:t>☐  Wut zeige ich selten — sie verschwindet nicht, sie verändert sich nur.</w:t>
+        <w:t>☐ Wut zeige ich selten — sie verschwindet nicht, sie verändert sich nur.</w:t>
       </w:r>
     </w:p>
     <w:p>
@@ -559,7 +559,7 @@
         <w:rPr>
           <w:sz w:val="21"/>
         </w:rPr>
-        <w:t>☐  Mein Körper meldet sich mit Beschwerden, die ich lange überhört habe.</w:t>
+        <w:t>☐ Mein Körper meldet sich mit Beschwerden, die ich lange überhört habe.</w:t>
       </w:r>
     </w:p>
     <w:p>
@@ -572,7 +572,7 @@
         <w:rPr>
           <w:sz w:val="21"/>
         </w:rPr>
-        <w:t>☐  Alleinsein fühlt sich eher bedrohlich an als erholsam.</w:t>
+        <w:t>☐ Alleinsein fühlt sich eher bedrohlich an als erholsam.</w:t>
       </w:r>
     </w:p>
     <w:p>

</xml_diff>

<commit_message>
Buch 4: Tippfehler und Gedankenstrich-Regelverstösse behoben, alle Formate geprüft
Inhaltliche Lesung des Manuskripts, Rechtschreibprüfung mit hunspell,
Rechtssicherheits- und Leere-Seiten-Check in Taschenbuch, eBook und Journal.
Ein Tippfehler im Hauptbuch (seid/seit) und 14 Verstösse gegen die
Gedankenstrich-/Auslassungspunkte-Regel im Journal behoben, Taschenbuch-PDF,
eBook und Journal-PDF daraus neu gebaut. Zwei ungelöste Cover-Befunde
(Gedankenstrich und falsche Kapitelzahl auf dem Journal-Cover) dokumentiert,
da dafür die Design-Quelldatei fehlt bzw. eine inhaltliche Entscheidung nötig ist.
</commit_message>
<xml_diff>
--- a/outputs/buch-an-mich-denken/buch4-Journal-MANUSKRIPT.docx
+++ b/outputs/buch-an-mich-denken/buch4-Journal-MANUSKRIPT.docx
@@ -494,7 +494,7 @@
         <w:rPr>
           <w:sz w:val="21"/>
         </w:rPr>
-        <w:t>☐ Ich spüre zuerst, was andere brauchen — und erst spät, was ich brauche.</w:t>
+        <w:t>☐ Ich spüre zuerst, was andere brauchen, und erst spät, was ich brauche.</w:t>
       </w:r>
     </w:p>
     <w:p>
@@ -546,7 +546,7 @@
         <w:rPr>
           <w:sz w:val="21"/>
         </w:rPr>
-        <w:t>☐ Wut zeige ich selten — sie verschwindet nicht, sie verändert sich nur.</w:t>
+        <w:t>☐ Wut zeige ich selten, sie verschwindet nicht, sie verändert sich nur.</w:t>
       </w:r>
     </w:p>
     <w:p>
@@ -822,7 +822,7 @@
         <w:rPr>
           <w:sz w:val="21"/>
         </w:rPr>
-        <w:t>Schreib den Satz „Als Kind habe ich gelernt …“ zu Ende. Ohne ihn zu beschönigen.</w:t>
+        <w:t>Schreib den Satz „Als Kind habe ich gelernt“ zu Ende. Ohne ihn zu beschönigen.</w:t>
       </w:r>
     </w:p>
     <w:p>
@@ -1590,7 +1590,7 @@
         <w:rPr>
           <w:sz w:val="21"/>
         </w:rPr>
-        <w:t>Schreib drei Sätze, die mit „Ich möchte …“ beginnen. Ohne „aber“ danach.</w:t>
+        <w:t>Schreib drei Sätze, die mit „Ich möchte“ beginnen. Ohne „aber“ danach.</w:t>
       </w:r>
     </w:p>
     <w:p>
@@ -2101,7 +2101,7 @@
         <w:rPr>
           <w:sz w:val="21"/>
         </w:rPr>
-        <w:t>Beschreib deinen „Auto-Ort“ — den Ort, an dem du kurz niemandem gehörst.</w:t>
+        <w:t>Beschreib deinen „Auto-Ort“, den Ort, an dem du kurz niemandem gehörst.</w:t>
       </w:r>
     </w:p>
     <w:p>
@@ -2457,7 +2457,7 @@
           <w:b/>
           <w:sz w:val="21"/>
         </w:rPr>
-        <w:t>Was tust du, wenn du „für dich“ sorgst — und denkst du dabei wirklich an dich?</w:t>
+        <w:t>Was tust du, wenn du „für dich“ sorgst, und denkst du dabei wirklich an dich?</w:t>
       </w:r>
     </w:p>
     <w:p>
@@ -2612,7 +2612,7 @@
         <w:rPr>
           <w:sz w:val="21"/>
         </w:rPr>
-        <w:t>Tu heute eine Sache nur für dich — und rechtfertige sie vor niemandem, auch nicht vor dir selbst.</w:t>
+        <w:t>Tu heute eine Sache nur für dich, und rechtfertige sie vor niemandem, auch nicht vor dir selbst.</w:t>
       </w:r>
     </w:p>
     <w:p>
@@ -2760,7 +2760,7 @@
           <w:b/>
           <w:sz w:val="21"/>
         </w:rPr>
-        <w:t>Wer in deinem Leben liebt dich auch ohne deine Leistung — bist du dir da sicher?</w:t>
+        <w:t>Wer in deinem Leben liebt dich auch ohne deine Leistung, bist du dir da sicher?</w:t>
       </w:r>
     </w:p>
     <w:p>
@@ -3123,7 +3123,7 @@
         <w:rPr>
           <w:sz w:val="21"/>
         </w:rPr>
-        <w:t>Schreib drei Sätze, die mit „Ich brauche …“ beginnen.</w:t>
+        <w:t>Schreib drei Sätze, die mit „Ich brauche“ beginnen.</w:t>
       </w:r>
     </w:p>
     <w:p>
@@ -4039,7 +4039,7 @@
           <w:b/>
           <w:sz w:val="21"/>
         </w:rPr>
-        <w:t>Welche kostet dich nur — und warum hältst du daran fest?</w:t>
+        <w:t>Welche kostet dich nur, und warum hältst du daran fest?</w:t>
       </w:r>
     </w:p>
     <w:p>
@@ -4298,7 +4298,7 @@
           <w:b/>
           <w:sz w:val="21"/>
         </w:rPr>
-        <w:t>Was hat dich das bisher gekostet — konkret, in Zahlen?</w:t>
+        <w:t>Was hat dich das bisher gekostet, konkret, in Zahlen?</w:t>
       </w:r>
     </w:p>
     <w:p>
@@ -5285,7 +5285,7 @@
           <w:b/>
           <w:sz w:val="21"/>
         </w:rPr>
-        <w:t>Wofür gibst du problemlos Geld aus — und wofür nie, obwohl du es dir leisten könntest?</w:t>
+        <w:t>Wofür gibst du problemlos Geld aus, und wofür nie, obwohl du es dir leisten könntest?</w:t>
       </w:r>
     </w:p>
     <w:p>
@@ -5540,7 +5540,7 @@
           <w:b/>
           <w:sz w:val="21"/>
         </w:rPr>
-        <w:t>Wie fühlt sich Alleinsein für dich an — Erholung oder Bedrohung?</w:t>
+        <w:t>Wie fühlt sich Alleinsein für dich an, Erholung oder Bedrohung?</w:t>
       </w:r>
     </w:p>
     <w:p>
@@ -7567,7 +7567,7 @@
         <w:rPr>
           <w:sz w:val="19"/>
         </w:rPr>
-        <w:t>Facebook-Gruppe: Safe to Thrive — Dein Leben. Deine Regeln, https://www.facebook.com/share/g/17ca96zXDd/</w:t>
+        <w:t>Facebook-Gruppe: Safe to Thrive, Dein Leben. Deine Regeln, https://www.facebook.com/share/g/17ca96zXDd/</w:t>
       </w:r>
     </w:p>
     <w:p>

</xml_diff>

<commit_message>
Journal komplett auf aktuellen Buchstand gebracht: Titel, 13 neue Kapitel, neues Cover
- Titel von "Ich habe nie gelernt, an mich zu denken" auf "Ich stand nie
  auf meiner eigenen Liste" korrigiert (Manuskript + Cover)
- Kapitel 21-33 als neue Journal-Abschnitte ergänzt (Reflexionsfragen +
  kleine Übung, gleiches Format wie 1-20), 79 statt ~50 Seiten
- Cover komplett neu gebaut: Vorderseite nutzt jetzt das aktuelle
  Buchcover-Motiv (statt alter Kintsugi-Grafik mit falschem Titel), plus
  "Das Journal zum Buch"-Abzeichen; Rückseite neu getextet ("über 30
  Kapitel" statt "22"); Rücken auf 79 Seiten kalibriert (5,02 mm)
- Build-Skript tools/journal-cover-buch7.py, PAGES-Konstante bei künftigen
  Umfangsänderungen anpassen
</commit_message>
<xml_diff>
--- a/outputs/buch-an-mich-denken/buch4-Journal-MANUSKRIPT.docx
+++ b/outputs/buch-an-mich-denken/buch4-Journal-MANUSKRIPT.docx
@@ -21,7 +21,7 @@
           <w:b/>
           <w:sz w:val="60"/>
         </w:rPr>
-        <w:t>ICH HABE NIE GELERNT,</w:t>
+        <w:t>ICH STAND NIE AUF</w:t>
       </w:r>
     </w:p>
     <w:p>
@@ -36,7 +36,7 @@
           <w:b/>
           <w:sz w:val="60"/>
         </w:rPr>
-        <w:t>AN MICH ZU DENKEN</w:t>
+        <w:t>MEINER EIGENEN LISTE</w:t>
       </w:r>
     </w:p>
     <w:p>
@@ -7024,6 +7024,3282 @@
       <w:r>
         <w:br w:type="page"/>
       </w:r>
+    </w:p>
+    <w:p>
+      <w:pPr>
+        <w:rPr>
+          <w:rFonts w:hint="eastAsia"/>
+        </w:rPr>
+      </w:pPr>
+      <w:r>
+        <w:rPr>
+          <w:b/>
+          <w:color w:val="2B2B2B"/>
+          <w:sz w:val="36"/>
+        </w:rPr>
+        <w:t>Kapitel 21. Pflicht ist nicht dasselbe wie Liebe</w:t>
+      </w:r>
+    </w:p>
+    <w:p>
+      <w:pPr>
+        <w:rPr>
+          <w:rFonts w:hint="eastAsia"/>
+        </w:rPr>
+      </w:pPr>
+      <w:r>
+        <w:rPr>
+          <w:i/>
+          <w:sz w:val="21"/>
+        </w:rPr>
+        <w:t>Von aussen sehen beide oft gleich aus. Von innen fühlen sie sich völlig verschieden an.</w:t>
+      </w:r>
+    </w:p>
+    <w:p>
+      <w:pPr>
+        <w:rPr>
+          <w:rFonts w:hint="eastAsia"/>
+        </w:rPr>
+      </w:pPr>
+    </w:p>
+    <w:p>
+      <w:pPr>
+        <w:rPr>
+          <w:rFonts w:hint="eastAsia"/>
+        </w:rPr>
+      </w:pPr>
+      <w:r>
+        <w:rPr>
+          <w:b/>
+          <w:color w:val="B9727E"/>
+        </w:rPr>
+        <w:t>Zum Reflektieren</w:t>
+      </w:r>
+    </w:p>
+    <w:p>
+      <w:pPr>
+        <w:rPr>
+          <w:rFonts w:hint="eastAsia"/>
+        </w:rPr>
+      </w:pPr>
+      <w:r>
+        <w:rPr>
+          <w:i/>
+          <w:sz w:val="21"/>
+        </w:rPr>
+        <w:t>Welche Handlung von heute war ehrlich Pflicht, keine Liebe?</w:t>
+      </w:r>
+    </w:p>
+    <w:p>
+      <w:pPr>
+        <w:rPr>
+          <w:rFonts w:hint="eastAsia"/>
+        </w:rPr>
+      </w:pPr>
+      <w:r>
+        <w:rPr>
+          <w:color w:val="B8B8B8"/>
+        </w:rPr>
+        <w:t>_______________________________________________________</w:t>
+      </w:r>
+    </w:p>
+    <w:p>
+      <w:pPr>
+        <w:rPr>
+          <w:rFonts w:hint="eastAsia"/>
+        </w:rPr>
+      </w:pPr>
+      <w:r>
+        <w:rPr>
+          <w:color w:val="B8B8B8"/>
+        </w:rPr>
+        <w:t>_______________________________________________________</w:t>
+      </w:r>
+    </w:p>
+    <w:p>
+      <w:pPr>
+        <w:rPr>
+          <w:rFonts w:hint="eastAsia"/>
+        </w:rPr>
+      </w:pPr>
+    </w:p>
+    <w:p>
+      <w:pPr>
+        <w:rPr>
+          <w:rFonts w:hint="eastAsia"/>
+        </w:rPr>
+      </w:pPr>
+      <w:r>
+        <w:rPr>
+          <w:i/>
+          <w:sz w:val="21"/>
+        </w:rPr>
+        <w:t>Würdest du das auch tun, wenn niemand es je erfahren würde?</w:t>
+      </w:r>
+    </w:p>
+    <w:p>
+      <w:pPr>
+        <w:rPr>
+          <w:rFonts w:hint="eastAsia"/>
+        </w:rPr>
+      </w:pPr>
+      <w:r>
+        <w:rPr>
+          <w:color w:val="B8B8B8"/>
+        </w:rPr>
+        <w:t>_______________________________________________________</w:t>
+      </w:r>
+    </w:p>
+    <w:p>
+      <w:pPr>
+        <w:rPr>
+          <w:rFonts w:hint="eastAsia"/>
+        </w:rPr>
+      </w:pPr>
+      <w:r>
+        <w:rPr>
+          <w:color w:val="B8B8B8"/>
+        </w:rPr>
+        <w:t>_______________________________________________________</w:t>
+      </w:r>
+    </w:p>
+    <w:p>
+      <w:pPr>
+        <w:rPr>
+          <w:rFonts w:hint="eastAsia"/>
+        </w:rPr>
+      </w:pPr>
+    </w:p>
+    <w:p>
+      <w:pPr>
+        <w:rPr>
+          <w:rFonts w:hint="eastAsia"/>
+        </w:rPr>
+      </w:pPr>
+      <w:r>
+        <w:rPr>
+          <w:i/>
+          <w:sz w:val="21"/>
+        </w:rPr>
+        <w:t>Wo verwechselst du am häufigsten die beiden?</w:t>
+      </w:r>
+    </w:p>
+    <w:p>
+      <w:pPr>
+        <w:rPr>
+          <w:rFonts w:hint="eastAsia"/>
+        </w:rPr>
+      </w:pPr>
+      <w:r>
+        <w:rPr>
+          <w:color w:val="B8B8B8"/>
+        </w:rPr>
+        <w:t>_______________________________________________________</w:t>
+      </w:r>
+    </w:p>
+    <w:p>
+      <w:pPr>
+        <w:rPr>
+          <w:rFonts w:hint="eastAsia"/>
+        </w:rPr>
+      </w:pPr>
+      <w:r>
+        <w:rPr>
+          <w:color w:val="B8B8B8"/>
+        </w:rPr>
+        <w:t>_______________________________________________________</w:t>
+      </w:r>
+    </w:p>
+    <w:p>
+      <w:pPr>
+        <w:rPr>
+          <w:rFonts w:hint="eastAsia"/>
+        </w:rPr>
+      </w:pPr>
+    </w:p>
+    <w:p>
+      <w:pPr>
+        <w:rPr>
+          <w:rFonts w:hint="eastAsia"/>
+        </w:rPr>
+      </w:pPr>
+      <w:r>
+        <w:rPr>
+          <w:b/>
+          <w:color w:val="B9727E"/>
+        </w:rPr>
+        <w:t>Kleine Übung</w:t>
+      </w:r>
+    </w:p>
+    <w:p>
+      <w:pPr>
+        <w:rPr>
+          <w:rFonts w:hint="eastAsia"/>
+        </w:rPr>
+      </w:pPr>
+      <w:r>
+        <w:rPr>
+          <w:i/>
+          <w:sz w:val="21"/>
+        </w:rPr>
+        <w:t>Schreib fünf Dinge auf, die du diese Woche für andere getan hast, und markiere: Pflicht oder Liebe.</w:t>
+      </w:r>
+    </w:p>
+    <w:p>
+      <w:pPr>
+        <w:rPr>
+          <w:rFonts w:hint="eastAsia"/>
+        </w:rPr>
+      </w:pPr>
+      <w:r>
+        <w:rPr>
+          <w:color w:val="B8B8B8"/>
+        </w:rPr>
+        <w:t>_______________________________________________________</w:t>
+      </w:r>
+    </w:p>
+    <w:p>
+      <w:pPr>
+        <w:rPr>
+          <w:rFonts w:hint="eastAsia"/>
+        </w:rPr>
+      </w:pPr>
+      <w:r>
+        <w:rPr>
+          <w:color w:val="B8B8B8"/>
+        </w:rPr>
+        <w:t>_______________________________________________________</w:t>
+      </w:r>
+    </w:p>
+    <w:p>
+      <w:pPr>
+        <w:rPr>
+          <w:rFonts w:hint="eastAsia"/>
+        </w:rPr>
+      </w:pPr>
+    </w:p>
+    <w:p>
+      <w:pPr>
+        <w:rPr>
+          <w:rFonts w:hint="eastAsia"/>
+        </w:rPr>
+      </w:pPr>
+      <w:r>
+        <w:rPr>
+          <w:b/>
+          <w:color w:val="2B2B2B"/>
+          <w:sz w:val="36"/>
+        </w:rPr>
+        <w:t>Kapitel 22. Wenn der Körper schon lange warnt</w:t>
+      </w:r>
+    </w:p>
+    <w:p>
+      <w:pPr>
+        <w:rPr>
+          <w:rFonts w:hint="eastAsia"/>
+        </w:rPr>
+      </w:pPr>
+      <w:r>
+        <w:rPr>
+          <w:i/>
+          <w:sz w:val="21"/>
+        </w:rPr>
+        <w:t>Der Körper meldet sich meistens zuerst leise, lange bevor er lauter wird.</w:t>
+      </w:r>
+    </w:p>
+    <w:p>
+      <w:pPr>
+        <w:rPr>
+          <w:rFonts w:hint="eastAsia"/>
+        </w:rPr>
+      </w:pPr>
+    </w:p>
+    <w:p>
+      <w:pPr>
+        <w:rPr>
+          <w:rFonts w:hint="eastAsia"/>
+        </w:rPr>
+      </w:pPr>
+      <w:r>
+        <w:rPr>
+          <w:b/>
+          <w:color w:val="B9727E"/>
+        </w:rPr>
+        <w:t>Zum Reflektieren</w:t>
+      </w:r>
+    </w:p>
+    <w:p>
+      <w:pPr>
+        <w:rPr>
+          <w:rFonts w:hint="eastAsia"/>
+        </w:rPr>
+      </w:pPr>
+      <w:r>
+        <w:rPr>
+          <w:i/>
+          <w:sz w:val="21"/>
+        </w:rPr>
+        <w:t>Welches körperliche Signal hast du bisher am konsequentesten ignoriert?</w:t>
+      </w:r>
+    </w:p>
+    <w:p>
+      <w:pPr>
+        <w:rPr>
+          <w:rFonts w:hint="eastAsia"/>
+        </w:rPr>
+      </w:pPr>
+      <w:r>
+        <w:rPr>
+          <w:color w:val="B8B8B8"/>
+        </w:rPr>
+        <w:t>_______________________________________________________</w:t>
+      </w:r>
+    </w:p>
+    <w:p>
+      <w:pPr>
+        <w:rPr>
+          <w:rFonts w:hint="eastAsia"/>
+        </w:rPr>
+      </w:pPr>
+      <w:r>
+        <w:rPr>
+          <w:color w:val="B8B8B8"/>
+        </w:rPr>
+        <w:t>_______________________________________________________</w:t>
+      </w:r>
+    </w:p>
+    <w:p>
+      <w:pPr>
+        <w:rPr>
+          <w:rFonts w:hint="eastAsia"/>
+        </w:rPr>
+      </w:pPr>
+    </w:p>
+    <w:p>
+      <w:pPr>
+        <w:rPr>
+          <w:rFonts w:hint="eastAsia"/>
+        </w:rPr>
+      </w:pPr>
+      <w:r>
+        <w:rPr>
+          <w:i/>
+          <w:sz w:val="21"/>
+        </w:rPr>
+        <w:t>Seit wann gibt es dieses Signal schon?</w:t>
+      </w:r>
+    </w:p>
+    <w:p>
+      <w:pPr>
+        <w:rPr>
+          <w:rFonts w:hint="eastAsia"/>
+        </w:rPr>
+      </w:pPr>
+      <w:r>
+        <w:rPr>
+          <w:color w:val="B8B8B8"/>
+        </w:rPr>
+        <w:t>_______________________________________________________</w:t>
+      </w:r>
+    </w:p>
+    <w:p>
+      <w:pPr>
+        <w:rPr>
+          <w:rFonts w:hint="eastAsia"/>
+        </w:rPr>
+      </w:pPr>
+      <w:r>
+        <w:rPr>
+          <w:color w:val="B8B8B8"/>
+        </w:rPr>
+        <w:t>_______________________________________________________</w:t>
+      </w:r>
+    </w:p>
+    <w:p>
+      <w:pPr>
+        <w:rPr>
+          <w:rFonts w:hint="eastAsia"/>
+        </w:rPr>
+      </w:pPr>
+    </w:p>
+    <w:p>
+      <w:pPr>
+        <w:rPr>
+          <w:rFonts w:hint="eastAsia"/>
+        </w:rPr>
+      </w:pPr>
+      <w:r>
+        <w:rPr>
+          <w:i/>
+          <w:sz w:val="21"/>
+        </w:rPr>
+        <w:t>Was würde sich ändern, wenn du es diese Woche ernst nimmst?</w:t>
+      </w:r>
+    </w:p>
+    <w:p>
+      <w:pPr>
+        <w:rPr>
+          <w:rFonts w:hint="eastAsia"/>
+        </w:rPr>
+      </w:pPr>
+      <w:r>
+        <w:rPr>
+          <w:color w:val="B8B8B8"/>
+        </w:rPr>
+        <w:t>_______________________________________________________</w:t>
+      </w:r>
+    </w:p>
+    <w:p>
+      <w:pPr>
+        <w:rPr>
+          <w:rFonts w:hint="eastAsia"/>
+        </w:rPr>
+      </w:pPr>
+      <w:r>
+        <w:rPr>
+          <w:color w:val="B8B8B8"/>
+        </w:rPr>
+        <w:t>_______________________________________________________</w:t>
+      </w:r>
+    </w:p>
+    <w:p>
+      <w:pPr>
+        <w:rPr>
+          <w:rFonts w:hint="eastAsia"/>
+        </w:rPr>
+      </w:pPr>
+    </w:p>
+    <w:p>
+      <w:pPr>
+        <w:rPr>
+          <w:rFonts w:hint="eastAsia"/>
+        </w:rPr>
+      </w:pPr>
+      <w:r>
+        <w:rPr>
+          <w:b/>
+          <w:color w:val="B9727E"/>
+        </w:rPr>
+        <w:t>Kleine Übung</w:t>
+      </w:r>
+    </w:p>
+    <w:p>
+      <w:pPr>
+        <w:rPr>
+          <w:rFonts w:hint="eastAsia"/>
+        </w:rPr>
+      </w:pPr>
+      <w:r>
+        <w:rPr>
+          <w:i/>
+          <w:sz w:val="21"/>
+        </w:rPr>
+        <w:t>Beschreibe ein Frühwarnzeichen deines Körpers, so genau du kannst.</w:t>
+      </w:r>
+    </w:p>
+    <w:p>
+      <w:pPr>
+        <w:rPr>
+          <w:rFonts w:hint="eastAsia"/>
+        </w:rPr>
+      </w:pPr>
+      <w:r>
+        <w:rPr>
+          <w:color w:val="B8B8B8"/>
+        </w:rPr>
+        <w:t>_______________________________________________________</w:t>
+      </w:r>
+    </w:p>
+    <w:p>
+      <w:pPr>
+        <w:rPr>
+          <w:rFonts w:hint="eastAsia"/>
+        </w:rPr>
+      </w:pPr>
+      <w:r>
+        <w:rPr>
+          <w:color w:val="B8B8B8"/>
+        </w:rPr>
+        <w:t>_______________________________________________________</w:t>
+      </w:r>
+    </w:p>
+    <w:p>
+      <w:pPr>
+        <w:rPr>
+          <w:rFonts w:hint="eastAsia"/>
+        </w:rPr>
+      </w:pPr>
+    </w:p>
+    <w:p>
+      <w:pPr>
+        <w:rPr>
+          <w:rFonts w:hint="eastAsia"/>
+        </w:rPr>
+      </w:pPr>
+      <w:r>
+        <w:rPr>
+          <w:b/>
+          <w:color w:val="2B2B2B"/>
+          <w:sz w:val="36"/>
+        </w:rPr>
+        <w:t>Kapitel 23. „Ich schaffe das schon“ als Warnsignal</w:t>
+      </w:r>
+    </w:p>
+    <w:p>
+      <w:pPr>
+        <w:rPr>
+          <w:rFonts w:hint="eastAsia"/>
+        </w:rPr>
+      </w:pPr>
+      <w:r>
+        <w:rPr>
+          <w:i/>
+          <w:sz w:val="21"/>
+        </w:rPr>
+        <w:t>Der Satz klingt nach Stärke. Oft ist er der Moment, in dem eine Grenze überschritten wird.</w:t>
+      </w:r>
+    </w:p>
+    <w:p>
+      <w:pPr>
+        <w:rPr>
+          <w:rFonts w:hint="eastAsia"/>
+        </w:rPr>
+      </w:pPr>
+    </w:p>
+    <w:p>
+      <w:pPr>
+        <w:rPr>
+          <w:rFonts w:hint="eastAsia"/>
+        </w:rPr>
+      </w:pPr>
+      <w:r>
+        <w:rPr>
+          <w:b/>
+          <w:color w:val="B9727E"/>
+        </w:rPr>
+        <w:t>Zum Reflektieren</w:t>
+      </w:r>
+    </w:p>
+    <w:p>
+      <w:pPr>
+        <w:rPr>
+          <w:rFonts w:hint="eastAsia"/>
+        </w:rPr>
+      </w:pPr>
+      <w:r>
+        <w:rPr>
+          <w:i/>
+          <w:sz w:val="21"/>
+        </w:rPr>
+        <w:t>Wann hast du diesen Satz zuletzt zu dir selbst gesagt?</w:t>
+      </w:r>
+    </w:p>
+    <w:p>
+      <w:pPr>
+        <w:rPr>
+          <w:rFonts w:hint="eastAsia"/>
+        </w:rPr>
+      </w:pPr>
+      <w:r>
+        <w:rPr>
+          <w:color w:val="B8B8B8"/>
+        </w:rPr>
+        <w:t>_______________________________________________________</w:t>
+      </w:r>
+    </w:p>
+    <w:p>
+      <w:pPr>
+        <w:rPr>
+          <w:rFonts w:hint="eastAsia"/>
+        </w:rPr>
+      </w:pPr>
+      <w:r>
+        <w:rPr>
+          <w:color w:val="B8B8B8"/>
+        </w:rPr>
+        <w:t>_______________________________________________________</w:t>
+      </w:r>
+    </w:p>
+    <w:p>
+      <w:pPr>
+        <w:rPr>
+          <w:rFonts w:hint="eastAsia"/>
+        </w:rPr>
+      </w:pPr>
+    </w:p>
+    <w:p>
+      <w:pPr>
+        <w:rPr>
+          <w:rFonts w:hint="eastAsia"/>
+        </w:rPr>
+      </w:pPr>
+      <w:r>
+        <w:rPr>
+          <w:i/>
+          <w:sz w:val="21"/>
+        </w:rPr>
+        <w:t>War es eine ehrliche Einschätzung oder eine automatische Reaktion?</w:t>
+      </w:r>
+    </w:p>
+    <w:p>
+      <w:pPr>
+        <w:rPr>
+          <w:rFonts w:hint="eastAsia"/>
+        </w:rPr>
+      </w:pPr>
+      <w:r>
+        <w:rPr>
+          <w:color w:val="B8B8B8"/>
+        </w:rPr>
+        <w:t>_______________________________________________________</w:t>
+      </w:r>
+    </w:p>
+    <w:p>
+      <w:pPr>
+        <w:rPr>
+          <w:rFonts w:hint="eastAsia"/>
+        </w:rPr>
+      </w:pPr>
+      <w:r>
+        <w:rPr>
+          <w:color w:val="B8B8B8"/>
+        </w:rPr>
+        <w:t>_______________________________________________________</w:t>
+      </w:r>
+    </w:p>
+    <w:p>
+      <w:pPr>
+        <w:rPr>
+          <w:rFonts w:hint="eastAsia"/>
+        </w:rPr>
+      </w:pPr>
+    </w:p>
+    <w:p>
+      <w:pPr>
+        <w:rPr>
+          <w:rFonts w:hint="eastAsia"/>
+        </w:rPr>
+      </w:pPr>
+      <w:r>
+        <w:rPr>
+          <w:i/>
+          <w:sz w:val="21"/>
+        </w:rPr>
+        <w:t>Was wäre die ehrlichere Antwort gewesen?</w:t>
+      </w:r>
+    </w:p>
+    <w:p>
+      <w:pPr>
+        <w:rPr>
+          <w:rFonts w:hint="eastAsia"/>
+        </w:rPr>
+      </w:pPr>
+      <w:r>
+        <w:rPr>
+          <w:color w:val="B8B8B8"/>
+        </w:rPr>
+        <w:t>_______________________________________________________</w:t>
+      </w:r>
+    </w:p>
+    <w:p>
+      <w:pPr>
+        <w:rPr>
+          <w:rFonts w:hint="eastAsia"/>
+        </w:rPr>
+      </w:pPr>
+      <w:r>
+        <w:rPr>
+          <w:color w:val="B8B8B8"/>
+        </w:rPr>
+        <w:t>_______________________________________________________</w:t>
+      </w:r>
+    </w:p>
+    <w:p>
+      <w:pPr>
+        <w:rPr>
+          <w:rFonts w:hint="eastAsia"/>
+        </w:rPr>
+      </w:pPr>
+    </w:p>
+    <w:p>
+      <w:pPr>
+        <w:rPr>
+          <w:rFonts w:hint="eastAsia"/>
+        </w:rPr>
+      </w:pPr>
+      <w:r>
+        <w:rPr>
+          <w:b/>
+          <w:color w:val="B9727E"/>
+        </w:rPr>
+        <w:t>Kleine Übung</w:t>
+      </w:r>
+    </w:p>
+    <w:p>
+      <w:pPr>
+        <w:rPr>
+          <w:rFonts w:hint="eastAsia"/>
+        </w:rPr>
+      </w:pPr>
+      <w:r>
+        <w:rPr>
+          <w:i/>
+          <w:sz w:val="21"/>
+        </w:rPr>
+        <w:t>Schreib die Situation auf, in der du diesen Satz zuletzt benutzt hast.</w:t>
+      </w:r>
+    </w:p>
+    <w:p>
+      <w:pPr>
+        <w:rPr>
+          <w:rFonts w:hint="eastAsia"/>
+        </w:rPr>
+      </w:pPr>
+      <w:r>
+        <w:rPr>
+          <w:color w:val="B8B8B8"/>
+        </w:rPr>
+        <w:t>_______________________________________________________</w:t>
+      </w:r>
+    </w:p>
+    <w:p>
+      <w:pPr>
+        <w:rPr>
+          <w:rFonts w:hint="eastAsia"/>
+        </w:rPr>
+      </w:pPr>
+      <w:r>
+        <w:rPr>
+          <w:color w:val="B8B8B8"/>
+        </w:rPr>
+        <w:t>_______________________________________________________</w:t>
+      </w:r>
+    </w:p>
+    <w:p>
+      <w:pPr>
+        <w:rPr>
+          <w:rFonts w:hint="eastAsia"/>
+        </w:rPr>
+      </w:pPr>
+    </w:p>
+    <w:p>
+      <w:pPr>
+        <w:rPr>
+          <w:rFonts w:hint="eastAsia"/>
+        </w:rPr>
+      </w:pPr>
+      <w:r>
+        <w:rPr>
+          <w:b/>
+          <w:color w:val="2B2B2B"/>
+          <w:sz w:val="36"/>
+        </w:rPr>
+        <w:t>Kapitel 24. Der Wendepunkt, den niemand ankündigt</w:t>
+      </w:r>
+    </w:p>
+    <w:p>
+      <w:pPr>
+        <w:rPr>
+          <w:rFonts w:hint="eastAsia"/>
+        </w:rPr>
+      </w:pPr>
+      <w:r>
+        <w:rPr>
+          <w:i/>
+          <w:sz w:val="21"/>
+        </w:rPr>
+        <w:t>Echte Wendepunkte sehen selten wie ein Feuerwerk aus. Meistens wie ein gewöhnlicher Tag.</w:t>
+      </w:r>
+    </w:p>
+    <w:p>
+      <w:pPr>
+        <w:rPr>
+          <w:rFonts w:hint="eastAsia"/>
+        </w:rPr>
+      </w:pPr>
+    </w:p>
+    <w:p>
+      <w:pPr>
+        <w:rPr>
+          <w:rFonts w:hint="eastAsia"/>
+        </w:rPr>
+      </w:pPr>
+      <w:r>
+        <w:rPr>
+          <w:b/>
+          <w:color w:val="B9727E"/>
+        </w:rPr>
+        <w:t>Zum Reflektieren</w:t>
+      </w:r>
+    </w:p>
+    <w:p>
+      <w:pPr>
+        <w:rPr>
+          <w:rFonts w:hint="eastAsia"/>
+        </w:rPr>
+      </w:pPr>
+      <w:r>
+        <w:rPr>
+          <w:i/>
+          <w:sz w:val="21"/>
+        </w:rPr>
+        <w:t>Gab es schon einen solchen gewöhnlichen Moment bei dir?</w:t>
+      </w:r>
+    </w:p>
+    <w:p>
+      <w:pPr>
+        <w:rPr>
+          <w:rFonts w:hint="eastAsia"/>
+        </w:rPr>
+      </w:pPr>
+      <w:r>
+        <w:rPr>
+          <w:color w:val="B8B8B8"/>
+        </w:rPr>
+        <w:t>_______________________________________________________</w:t>
+      </w:r>
+    </w:p>
+    <w:p>
+      <w:pPr>
+        <w:rPr>
+          <w:rFonts w:hint="eastAsia"/>
+        </w:rPr>
+      </w:pPr>
+      <w:r>
+        <w:rPr>
+          <w:color w:val="B8B8B8"/>
+        </w:rPr>
+        <w:t>_______________________________________________________</w:t>
+      </w:r>
+    </w:p>
+    <w:p>
+      <w:pPr>
+        <w:rPr>
+          <w:rFonts w:hint="eastAsia"/>
+        </w:rPr>
+      </w:pPr>
+    </w:p>
+    <w:p>
+      <w:pPr>
+        <w:rPr>
+          <w:rFonts w:hint="eastAsia"/>
+        </w:rPr>
+      </w:pPr>
+      <w:r>
+        <w:rPr>
+          <w:i/>
+          <w:sz w:val="21"/>
+        </w:rPr>
+        <w:t>Woran hast du ihn erkannt, im Rückblick?</w:t>
+      </w:r>
+    </w:p>
+    <w:p>
+      <w:pPr>
+        <w:rPr>
+          <w:rFonts w:hint="eastAsia"/>
+        </w:rPr>
+      </w:pPr>
+      <w:r>
+        <w:rPr>
+          <w:color w:val="B8B8B8"/>
+        </w:rPr>
+        <w:t>_______________________________________________________</w:t>
+      </w:r>
+    </w:p>
+    <w:p>
+      <w:pPr>
+        <w:rPr>
+          <w:rFonts w:hint="eastAsia"/>
+        </w:rPr>
+      </w:pPr>
+      <w:r>
+        <w:rPr>
+          <w:color w:val="B8B8B8"/>
+        </w:rPr>
+        <w:t>_______________________________________________________</w:t>
+      </w:r>
+    </w:p>
+    <w:p>
+      <w:pPr>
+        <w:rPr>
+          <w:rFonts w:hint="eastAsia"/>
+        </w:rPr>
+      </w:pPr>
+    </w:p>
+    <w:p>
+      <w:pPr>
+        <w:rPr>
+          <w:rFonts w:hint="eastAsia"/>
+        </w:rPr>
+      </w:pPr>
+      <w:r>
+        <w:rPr>
+          <w:i/>
+          <w:sz w:val="21"/>
+        </w:rPr>
+        <w:t>Was hat sich seither, auch nur ein kleines bisschen, verändert?</w:t>
+      </w:r>
+    </w:p>
+    <w:p>
+      <w:pPr>
+        <w:rPr>
+          <w:rFonts w:hint="eastAsia"/>
+        </w:rPr>
+      </w:pPr>
+      <w:r>
+        <w:rPr>
+          <w:color w:val="B8B8B8"/>
+        </w:rPr>
+        <w:t>_______________________________________________________</w:t>
+      </w:r>
+    </w:p>
+    <w:p>
+      <w:pPr>
+        <w:rPr>
+          <w:rFonts w:hint="eastAsia"/>
+        </w:rPr>
+      </w:pPr>
+      <w:r>
+        <w:rPr>
+          <w:color w:val="B8B8B8"/>
+        </w:rPr>
+        <w:t>_______________________________________________________</w:t>
+      </w:r>
+    </w:p>
+    <w:p>
+      <w:pPr>
+        <w:rPr>
+          <w:rFonts w:hint="eastAsia"/>
+        </w:rPr>
+      </w:pPr>
+    </w:p>
+    <w:p>
+      <w:pPr>
+        <w:rPr>
+          <w:rFonts w:hint="eastAsia"/>
+        </w:rPr>
+      </w:pPr>
+      <w:r>
+        <w:rPr>
+          <w:b/>
+          <w:color w:val="B9727E"/>
+        </w:rPr>
+        <w:t>Kleine Übung</w:t>
+      </w:r>
+    </w:p>
+    <w:p>
+      <w:pPr>
+        <w:rPr>
+          <w:rFonts w:hint="eastAsia"/>
+        </w:rPr>
+      </w:pPr>
+      <w:r>
+        <w:rPr>
+          <w:i/>
+          <w:sz w:val="21"/>
+        </w:rPr>
+        <w:t>Beschreib einen gewöhnlichen Moment, der im Rückblick doch ein Anfang war.</w:t>
+      </w:r>
+    </w:p>
+    <w:p>
+      <w:pPr>
+        <w:rPr>
+          <w:rFonts w:hint="eastAsia"/>
+        </w:rPr>
+      </w:pPr>
+      <w:r>
+        <w:rPr>
+          <w:color w:val="B8B8B8"/>
+        </w:rPr>
+        <w:t>_______________________________________________________</w:t>
+      </w:r>
+    </w:p>
+    <w:p>
+      <w:pPr>
+        <w:rPr>
+          <w:rFonts w:hint="eastAsia"/>
+        </w:rPr>
+      </w:pPr>
+      <w:r>
+        <w:rPr>
+          <w:color w:val="B8B8B8"/>
+        </w:rPr>
+        <w:t>_______________________________________________________</w:t>
+      </w:r>
+    </w:p>
+    <w:p>
+      <w:pPr>
+        <w:rPr>
+          <w:rFonts w:hint="eastAsia"/>
+        </w:rPr>
+      </w:pPr>
+    </w:p>
+    <w:p>
+      <w:pPr>
+        <w:rPr>
+          <w:rFonts w:hint="eastAsia"/>
+        </w:rPr>
+      </w:pPr>
+      <w:r>
+        <w:rPr>
+          <w:b/>
+          <w:color w:val="2B2B2B"/>
+          <w:sz w:val="36"/>
+        </w:rPr>
+        <w:t>Kapitel 25. Hilfe annehmen, ohne dich schuldig zu fühlen</w:t>
+      </w:r>
+    </w:p>
+    <w:p>
+      <w:pPr>
+        <w:rPr>
+          <w:rFonts w:hint="eastAsia"/>
+        </w:rPr>
+      </w:pPr>
+      <w:r>
+        <w:rPr>
+          <w:i/>
+          <w:sz w:val="21"/>
+        </w:rPr>
+        <w:t>Für viele ist Hilfe annehmen schwerer als Hilfe geben.</w:t>
+      </w:r>
+    </w:p>
+    <w:p>
+      <w:pPr>
+        <w:rPr>
+          <w:rFonts w:hint="eastAsia"/>
+        </w:rPr>
+      </w:pPr>
+    </w:p>
+    <w:p>
+      <w:pPr>
+        <w:rPr>
+          <w:rFonts w:hint="eastAsia"/>
+        </w:rPr>
+      </w:pPr>
+      <w:r>
+        <w:rPr>
+          <w:b/>
+          <w:color w:val="B9727E"/>
+        </w:rPr>
+        <w:t>Zum Reflektieren</w:t>
+      </w:r>
+    </w:p>
+    <w:p>
+      <w:pPr>
+        <w:rPr>
+          <w:rFonts w:hint="eastAsia"/>
+        </w:rPr>
+      </w:pPr>
+      <w:r>
+        <w:rPr>
+          <w:i/>
+          <w:sz w:val="21"/>
+        </w:rPr>
+        <w:t>Wann hast du zuletzt aktiv um Hilfe gebeten?</w:t>
+      </w:r>
+    </w:p>
+    <w:p>
+      <w:pPr>
+        <w:rPr>
+          <w:rFonts w:hint="eastAsia"/>
+        </w:rPr>
+      </w:pPr>
+      <w:r>
+        <w:rPr>
+          <w:color w:val="B8B8B8"/>
+        </w:rPr>
+        <w:t>_______________________________________________________</w:t>
+      </w:r>
+    </w:p>
+    <w:p>
+      <w:pPr>
+        <w:rPr>
+          <w:rFonts w:hint="eastAsia"/>
+        </w:rPr>
+      </w:pPr>
+      <w:r>
+        <w:rPr>
+          <w:color w:val="B8B8B8"/>
+        </w:rPr>
+        <w:t>_______________________________________________________</w:t>
+      </w:r>
+    </w:p>
+    <w:p>
+      <w:pPr>
+        <w:rPr>
+          <w:rFonts w:hint="eastAsia"/>
+        </w:rPr>
+      </w:pPr>
+    </w:p>
+    <w:p>
+      <w:pPr>
+        <w:rPr>
+          <w:rFonts w:hint="eastAsia"/>
+        </w:rPr>
+      </w:pPr>
+      <w:r>
+        <w:rPr>
+          <w:i/>
+          <w:sz w:val="21"/>
+        </w:rPr>
+        <w:t>Was hast du dir vorgestellt, dass die andere Person von dir denkt?</w:t>
+      </w:r>
+    </w:p>
+    <w:p>
+      <w:pPr>
+        <w:rPr>
+          <w:rFonts w:hint="eastAsia"/>
+        </w:rPr>
+      </w:pPr>
+      <w:r>
+        <w:rPr>
+          <w:color w:val="B8B8B8"/>
+        </w:rPr>
+        <w:t>_______________________________________________________</w:t>
+      </w:r>
+    </w:p>
+    <w:p>
+      <w:pPr>
+        <w:rPr>
+          <w:rFonts w:hint="eastAsia"/>
+        </w:rPr>
+      </w:pPr>
+      <w:r>
+        <w:rPr>
+          <w:color w:val="B8B8B8"/>
+        </w:rPr>
+        <w:t>_______________________________________________________</w:t>
+      </w:r>
+    </w:p>
+    <w:p>
+      <w:pPr>
+        <w:rPr>
+          <w:rFonts w:hint="eastAsia"/>
+        </w:rPr>
+      </w:pPr>
+    </w:p>
+    <w:p>
+      <w:pPr>
+        <w:rPr>
+          <w:rFonts w:hint="eastAsia"/>
+        </w:rPr>
+      </w:pPr>
+      <w:r>
+        <w:rPr>
+          <w:i/>
+          <w:sz w:val="21"/>
+        </w:rPr>
+        <w:t>Was ist tatsächlich passiert?</w:t>
+      </w:r>
+    </w:p>
+    <w:p>
+      <w:pPr>
+        <w:rPr>
+          <w:rFonts w:hint="eastAsia"/>
+        </w:rPr>
+      </w:pPr>
+      <w:r>
+        <w:rPr>
+          <w:color w:val="B8B8B8"/>
+        </w:rPr>
+        <w:t>_______________________________________________________</w:t>
+      </w:r>
+    </w:p>
+    <w:p>
+      <w:pPr>
+        <w:rPr>
+          <w:rFonts w:hint="eastAsia"/>
+        </w:rPr>
+      </w:pPr>
+      <w:r>
+        <w:rPr>
+          <w:color w:val="B8B8B8"/>
+        </w:rPr>
+        <w:t>_______________________________________________________</w:t>
+      </w:r>
+    </w:p>
+    <w:p>
+      <w:pPr>
+        <w:rPr>
+          <w:rFonts w:hint="eastAsia"/>
+        </w:rPr>
+      </w:pPr>
+    </w:p>
+    <w:p>
+      <w:pPr>
+        <w:rPr>
+          <w:rFonts w:hint="eastAsia"/>
+        </w:rPr>
+      </w:pPr>
+      <w:r>
+        <w:rPr>
+          <w:b/>
+          <w:color w:val="B9727E"/>
+        </w:rPr>
+        <w:t>Kleine Übung</w:t>
+      </w:r>
+    </w:p>
+    <w:p>
+      <w:pPr>
+        <w:rPr>
+          <w:rFonts w:hint="eastAsia"/>
+        </w:rPr>
+      </w:pPr>
+      <w:r>
+        <w:rPr>
+          <w:i/>
+          <w:sz w:val="21"/>
+        </w:rPr>
+        <w:t>Bitte diese Woche einmal aktiv um Hilfe, bei etwas Kleinem, und notiere, wie es war.</w:t>
+      </w:r>
+    </w:p>
+    <w:p>
+      <w:pPr>
+        <w:rPr>
+          <w:rFonts w:hint="eastAsia"/>
+        </w:rPr>
+      </w:pPr>
+      <w:r>
+        <w:rPr>
+          <w:color w:val="B8B8B8"/>
+        </w:rPr>
+        <w:t>_______________________________________________________</w:t>
+      </w:r>
+    </w:p>
+    <w:p>
+      <w:pPr>
+        <w:rPr>
+          <w:rFonts w:hint="eastAsia"/>
+        </w:rPr>
+      </w:pPr>
+      <w:r>
+        <w:rPr>
+          <w:color w:val="B8B8B8"/>
+        </w:rPr>
+        <w:t>_______________________________________________________</w:t>
+      </w:r>
+    </w:p>
+    <w:p>
+      <w:pPr>
+        <w:rPr>
+          <w:rFonts w:hint="eastAsia"/>
+        </w:rPr>
+      </w:pPr>
+    </w:p>
+    <w:p>
+      <w:pPr>
+        <w:rPr>
+          <w:rFonts w:hint="eastAsia"/>
+        </w:rPr>
+      </w:pPr>
+      <w:r>
+        <w:rPr>
+          <w:b/>
+          <w:color w:val="2B2B2B"/>
+          <w:sz w:val="36"/>
+        </w:rPr>
+        <w:t>Kapitel 26. Der Unterschied zwischen Rücksicht und Selbstaufgabe</w:t>
+      </w:r>
+    </w:p>
+    <w:p>
+      <w:pPr>
+        <w:rPr>
+          <w:rFonts w:hint="eastAsia"/>
+        </w:rPr>
+      </w:pPr>
+      <w:r>
+        <w:rPr>
+          <w:i/>
+          <w:sz w:val="21"/>
+        </w:rPr>
+        <w:t>Rücksicht bezieht dich mit ein. Selbstaufgabe streicht dich ganz.</w:t>
+      </w:r>
+    </w:p>
+    <w:p>
+      <w:pPr>
+        <w:rPr>
+          <w:rFonts w:hint="eastAsia"/>
+        </w:rPr>
+      </w:pPr>
+    </w:p>
+    <w:p>
+      <w:pPr>
+        <w:rPr>
+          <w:rFonts w:hint="eastAsia"/>
+        </w:rPr>
+      </w:pPr>
+      <w:r>
+        <w:rPr>
+          <w:b/>
+          <w:color w:val="B9727E"/>
+        </w:rPr>
+        <w:t>Zum Reflektieren</w:t>
+      </w:r>
+    </w:p>
+    <w:p>
+      <w:pPr>
+        <w:rPr>
+          <w:rFonts w:hint="eastAsia"/>
+        </w:rPr>
+      </w:pPr>
+      <w:r>
+        <w:rPr>
+          <w:i/>
+          <w:sz w:val="21"/>
+        </w:rPr>
+        <w:t>Bei welcher Entscheidung war für dich selbst kein Platz mehr?</w:t>
+      </w:r>
+    </w:p>
+    <w:p>
+      <w:pPr>
+        <w:rPr>
+          <w:rFonts w:hint="eastAsia"/>
+        </w:rPr>
+      </w:pPr>
+      <w:r>
+        <w:rPr>
+          <w:color w:val="B8B8B8"/>
+        </w:rPr>
+        <w:t>_______________________________________________________</w:t>
+      </w:r>
+    </w:p>
+    <w:p>
+      <w:pPr>
+        <w:rPr>
+          <w:rFonts w:hint="eastAsia"/>
+        </w:rPr>
+      </w:pPr>
+      <w:r>
+        <w:rPr>
+          <w:color w:val="B8B8B8"/>
+        </w:rPr>
+        <w:t>_______________________________________________________</w:t>
+      </w:r>
+    </w:p>
+    <w:p>
+      <w:pPr>
+        <w:rPr>
+          <w:rFonts w:hint="eastAsia"/>
+        </w:rPr>
+      </w:pPr>
+    </w:p>
+    <w:p>
+      <w:pPr>
+        <w:rPr>
+          <w:rFonts w:hint="eastAsia"/>
+        </w:rPr>
+      </w:pPr>
+      <w:r>
+        <w:rPr>
+          <w:i/>
+          <w:sz w:val="21"/>
+        </w:rPr>
+        <w:t>Wie hätte echte Rücksicht statt Selbstaufgabe ausgesehen?</w:t>
+      </w:r>
+    </w:p>
+    <w:p>
+      <w:pPr>
+        <w:rPr>
+          <w:rFonts w:hint="eastAsia"/>
+        </w:rPr>
+      </w:pPr>
+      <w:r>
+        <w:rPr>
+          <w:color w:val="B8B8B8"/>
+        </w:rPr>
+        <w:t>_______________________________________________________</w:t>
+      </w:r>
+    </w:p>
+    <w:p>
+      <w:pPr>
+        <w:rPr>
+          <w:rFonts w:hint="eastAsia"/>
+        </w:rPr>
+      </w:pPr>
+      <w:r>
+        <w:rPr>
+          <w:color w:val="B8B8B8"/>
+        </w:rPr>
+        <w:t>_______________________________________________________</w:t>
+      </w:r>
+    </w:p>
+    <w:p>
+      <w:pPr>
+        <w:rPr>
+          <w:rFonts w:hint="eastAsia"/>
+        </w:rPr>
+      </w:pPr>
+    </w:p>
+    <w:p>
+      <w:pPr>
+        <w:rPr>
+          <w:rFonts w:hint="eastAsia"/>
+        </w:rPr>
+      </w:pPr>
+      <w:r>
+        <w:rPr>
+          <w:i/>
+          <w:sz w:val="21"/>
+        </w:rPr>
+        <w:t>Wo gelingt dir der Unterschied inzwischen besser?</w:t>
+      </w:r>
+    </w:p>
+    <w:p>
+      <w:pPr>
+        <w:rPr>
+          <w:rFonts w:hint="eastAsia"/>
+        </w:rPr>
+      </w:pPr>
+      <w:r>
+        <w:rPr>
+          <w:color w:val="B8B8B8"/>
+        </w:rPr>
+        <w:t>_______________________________________________________</w:t>
+      </w:r>
+    </w:p>
+    <w:p>
+      <w:pPr>
+        <w:rPr>
+          <w:rFonts w:hint="eastAsia"/>
+        </w:rPr>
+      </w:pPr>
+      <w:r>
+        <w:rPr>
+          <w:color w:val="B8B8B8"/>
+        </w:rPr>
+        <w:t>_______________________________________________________</w:t>
+      </w:r>
+    </w:p>
+    <w:p>
+      <w:pPr>
+        <w:rPr>
+          <w:rFonts w:hint="eastAsia"/>
+        </w:rPr>
+      </w:pPr>
+    </w:p>
+    <w:p>
+      <w:pPr>
+        <w:rPr>
+          <w:rFonts w:hint="eastAsia"/>
+        </w:rPr>
+      </w:pPr>
+      <w:r>
+        <w:rPr>
+          <w:b/>
+          <w:color w:val="B9727E"/>
+        </w:rPr>
+        <w:t>Kleine Übung</w:t>
+      </w:r>
+    </w:p>
+    <w:p>
+      <w:pPr>
+        <w:rPr>
+          <w:rFonts w:hint="eastAsia"/>
+        </w:rPr>
+      </w:pPr>
+      <w:r>
+        <w:rPr>
+          <w:i/>
+          <w:sz w:val="21"/>
+        </w:rPr>
+        <w:t>Nimm eine aktuelle Entscheidung und prüfe: bleibt darin ein Platz für dich?</w:t>
+      </w:r>
+    </w:p>
+    <w:p>
+      <w:pPr>
+        <w:rPr>
+          <w:rFonts w:hint="eastAsia"/>
+        </w:rPr>
+      </w:pPr>
+      <w:r>
+        <w:rPr>
+          <w:color w:val="B8B8B8"/>
+        </w:rPr>
+        <w:t>_______________________________________________________</w:t>
+      </w:r>
+    </w:p>
+    <w:p>
+      <w:pPr>
+        <w:rPr>
+          <w:rFonts w:hint="eastAsia"/>
+        </w:rPr>
+      </w:pPr>
+      <w:r>
+        <w:rPr>
+          <w:color w:val="B8B8B8"/>
+        </w:rPr>
+        <w:t>_______________________________________________________</w:t>
+      </w:r>
+    </w:p>
+    <w:p>
+      <w:pPr>
+        <w:rPr>
+          <w:rFonts w:hint="eastAsia"/>
+        </w:rPr>
+      </w:pPr>
+    </w:p>
+    <w:p>
+      <w:pPr>
+        <w:rPr>
+          <w:rFonts w:hint="eastAsia"/>
+        </w:rPr>
+      </w:pPr>
+      <w:r>
+        <w:rPr>
+          <w:b/>
+          <w:color w:val="2B2B2B"/>
+          <w:sz w:val="36"/>
+        </w:rPr>
+        <w:t>Kapitel 27. Warum „Perfekt“ der falsche Massstab ist</w:t>
+      </w:r>
+    </w:p>
+    <w:p>
+      <w:pPr>
+        <w:rPr>
+          <w:rFonts w:hint="eastAsia"/>
+        </w:rPr>
+      </w:pPr>
+      <w:r>
+        <w:rPr>
+          <w:i/>
+          <w:sz w:val="21"/>
+        </w:rPr>
+        <w:t>Der richtige Massstab ist nicht Perfektion, sondern Richtung.</w:t>
+      </w:r>
+    </w:p>
+    <w:p>
+      <w:pPr>
+        <w:rPr>
+          <w:rFonts w:hint="eastAsia"/>
+        </w:rPr>
+      </w:pPr>
+    </w:p>
+    <w:p>
+      <w:pPr>
+        <w:rPr>
+          <w:rFonts w:hint="eastAsia"/>
+        </w:rPr>
+      </w:pPr>
+      <w:r>
+        <w:rPr>
+          <w:b/>
+          <w:color w:val="B9727E"/>
+        </w:rPr>
+        <w:t>Zum Reflektieren</w:t>
+      </w:r>
+    </w:p>
+    <w:p>
+      <w:pPr>
+        <w:rPr>
+          <w:rFonts w:hint="eastAsia"/>
+        </w:rPr>
+      </w:pPr>
+      <w:r>
+        <w:rPr>
+          <w:i/>
+          <w:sz w:val="21"/>
+        </w:rPr>
+        <w:t>Wo verlangst du von deiner eigenen Veränderung Perfektion?</w:t>
+      </w:r>
+    </w:p>
+    <w:p>
+      <w:pPr>
+        <w:rPr>
+          <w:rFonts w:hint="eastAsia"/>
+        </w:rPr>
+      </w:pPr>
+      <w:r>
+        <w:rPr>
+          <w:color w:val="B8B8B8"/>
+        </w:rPr>
+        <w:t>_______________________________________________________</w:t>
+      </w:r>
+    </w:p>
+    <w:p>
+      <w:pPr>
+        <w:rPr>
+          <w:rFonts w:hint="eastAsia"/>
+        </w:rPr>
+      </w:pPr>
+      <w:r>
+        <w:rPr>
+          <w:color w:val="B8B8B8"/>
+        </w:rPr>
+        <w:t>_______________________________________________________</w:t>
+      </w:r>
+    </w:p>
+    <w:p>
+      <w:pPr>
+        <w:rPr>
+          <w:rFonts w:hint="eastAsia"/>
+        </w:rPr>
+      </w:pPr>
+    </w:p>
+    <w:p>
+      <w:pPr>
+        <w:rPr>
+          <w:rFonts w:hint="eastAsia"/>
+        </w:rPr>
+      </w:pPr>
+      <w:r>
+        <w:rPr>
+          <w:i/>
+          <w:sz w:val="21"/>
+        </w:rPr>
+        <w:t>Was ist ein Rückschritt, den du dir diese Woche verzeihen kannst?</w:t>
+      </w:r>
+    </w:p>
+    <w:p>
+      <w:pPr>
+        <w:rPr>
+          <w:rFonts w:hint="eastAsia"/>
+        </w:rPr>
+      </w:pPr>
+      <w:r>
+        <w:rPr>
+          <w:color w:val="B8B8B8"/>
+        </w:rPr>
+        <w:t>_______________________________________________________</w:t>
+      </w:r>
+    </w:p>
+    <w:p>
+      <w:pPr>
+        <w:rPr>
+          <w:rFonts w:hint="eastAsia"/>
+        </w:rPr>
+      </w:pPr>
+      <w:r>
+        <w:rPr>
+          <w:color w:val="B8B8B8"/>
+        </w:rPr>
+        <w:t>_______________________________________________________</w:t>
+      </w:r>
+    </w:p>
+    <w:p>
+      <w:pPr>
+        <w:rPr>
+          <w:rFonts w:hint="eastAsia"/>
+        </w:rPr>
+      </w:pPr>
+    </w:p>
+    <w:p>
+      <w:pPr>
+        <w:rPr>
+          <w:rFonts w:hint="eastAsia"/>
+        </w:rPr>
+      </w:pPr>
+      <w:r>
+        <w:rPr>
+          <w:i/>
+          <w:sz w:val="21"/>
+        </w:rPr>
+        <w:t>Machst du insgesamt mehr Schritte für dich als vor einem Jahr?</w:t>
+      </w:r>
+    </w:p>
+    <w:p>
+      <w:pPr>
+        <w:rPr>
+          <w:rFonts w:hint="eastAsia"/>
+        </w:rPr>
+      </w:pPr>
+      <w:r>
+        <w:rPr>
+          <w:color w:val="B8B8B8"/>
+        </w:rPr>
+        <w:t>_______________________________________________________</w:t>
+      </w:r>
+    </w:p>
+    <w:p>
+      <w:pPr>
+        <w:rPr>
+          <w:rFonts w:hint="eastAsia"/>
+        </w:rPr>
+      </w:pPr>
+      <w:r>
+        <w:rPr>
+          <w:color w:val="B8B8B8"/>
+        </w:rPr>
+        <w:t>_______________________________________________________</w:t>
+      </w:r>
+    </w:p>
+    <w:p>
+      <w:pPr>
+        <w:rPr>
+          <w:rFonts w:hint="eastAsia"/>
+        </w:rPr>
+      </w:pPr>
+    </w:p>
+    <w:p>
+      <w:pPr>
+        <w:rPr>
+          <w:rFonts w:hint="eastAsia"/>
+        </w:rPr>
+      </w:pPr>
+      <w:r>
+        <w:rPr>
+          <w:b/>
+          <w:color w:val="B9727E"/>
+        </w:rPr>
+        <w:t>Kleine Übung</w:t>
+      </w:r>
+    </w:p>
+    <w:p>
+      <w:pPr>
+        <w:rPr>
+          <w:rFonts w:hint="eastAsia"/>
+        </w:rPr>
+      </w:pPr>
+      <w:r>
+        <w:rPr>
+          <w:i/>
+          <w:sz w:val="21"/>
+        </w:rPr>
+        <w:t>Schreib einen Rückschritt der letzten Zeit auf und was du trotzdem daraus gelernt hast.</w:t>
+      </w:r>
+    </w:p>
+    <w:p>
+      <w:pPr>
+        <w:rPr>
+          <w:rFonts w:hint="eastAsia"/>
+        </w:rPr>
+      </w:pPr>
+      <w:r>
+        <w:rPr>
+          <w:color w:val="B8B8B8"/>
+        </w:rPr>
+        <w:t>_______________________________________________________</w:t>
+      </w:r>
+    </w:p>
+    <w:p>
+      <w:pPr>
+        <w:rPr>
+          <w:rFonts w:hint="eastAsia"/>
+        </w:rPr>
+      </w:pPr>
+      <w:r>
+        <w:rPr>
+          <w:color w:val="B8B8B8"/>
+        </w:rPr>
+        <w:t>_______________________________________________________</w:t>
+      </w:r>
+    </w:p>
+    <w:p>
+      <w:pPr>
+        <w:rPr>
+          <w:rFonts w:hint="eastAsia"/>
+        </w:rPr>
+      </w:pPr>
+    </w:p>
+    <w:p>
+      <w:pPr>
+        <w:rPr>
+          <w:rFonts w:hint="eastAsia"/>
+        </w:rPr>
+      </w:pPr>
+      <w:r>
+        <w:rPr>
+          <w:b/>
+          <w:color w:val="2B2B2B"/>
+          <w:sz w:val="36"/>
+        </w:rPr>
+        <w:t>Kapitel 28. Wenn Kinder das Muster spiegeln</w:t>
+      </w:r>
+    </w:p>
+    <w:p>
+      <w:pPr>
+        <w:rPr>
+          <w:rFonts w:hint="eastAsia"/>
+        </w:rPr>
+      </w:pPr>
+      <w:r>
+        <w:rPr>
+          <w:i/>
+          <w:sz w:val="21"/>
+        </w:rPr>
+        <w:t>Kinder übernehmen, was sie vorgelebt sehen, nicht was ihnen erklärt wird.</w:t>
+      </w:r>
+    </w:p>
+    <w:p>
+      <w:pPr>
+        <w:rPr>
+          <w:rFonts w:hint="eastAsia"/>
+        </w:rPr>
+      </w:pPr>
+    </w:p>
+    <w:p>
+      <w:pPr>
+        <w:rPr>
+          <w:rFonts w:hint="eastAsia"/>
+        </w:rPr>
+      </w:pPr>
+      <w:r>
+        <w:rPr>
+          <w:b/>
+          <w:color w:val="B9727E"/>
+        </w:rPr>
+        <w:t>Zum Reflektieren</w:t>
+      </w:r>
+    </w:p>
+    <w:p>
+      <w:pPr>
+        <w:rPr>
+          <w:rFonts w:hint="eastAsia"/>
+        </w:rPr>
+      </w:pPr>
+      <w:r>
+        <w:rPr>
+          <w:i/>
+          <w:sz w:val="21"/>
+        </w:rPr>
+        <w:t>Wo hast du dein eigenes Muster schon bei jemand anderem wiedererkannt?</w:t>
+      </w:r>
+    </w:p>
+    <w:p>
+      <w:pPr>
+        <w:rPr>
+          <w:rFonts w:hint="eastAsia"/>
+        </w:rPr>
+      </w:pPr>
+      <w:r>
+        <w:rPr>
+          <w:color w:val="B8B8B8"/>
+        </w:rPr>
+        <w:t>_______________________________________________________</w:t>
+      </w:r>
+    </w:p>
+    <w:p>
+      <w:pPr>
+        <w:rPr>
+          <w:rFonts w:hint="eastAsia"/>
+        </w:rPr>
+      </w:pPr>
+      <w:r>
+        <w:rPr>
+          <w:color w:val="B8B8B8"/>
+        </w:rPr>
+        <w:t>_______________________________________________________</w:t>
+      </w:r>
+    </w:p>
+    <w:p>
+      <w:pPr>
+        <w:rPr>
+          <w:rFonts w:hint="eastAsia"/>
+        </w:rPr>
+      </w:pPr>
+    </w:p>
+    <w:p>
+      <w:pPr>
+        <w:rPr>
+          <w:rFonts w:hint="eastAsia"/>
+        </w:rPr>
+      </w:pPr>
+      <w:r>
+        <w:rPr>
+          <w:i/>
+          <w:sz w:val="21"/>
+        </w:rPr>
+        <w:t>Was würdest du diese Person gerne lehren, ohne ein Wort zu sagen?</w:t>
+      </w:r>
+    </w:p>
+    <w:p>
+      <w:pPr>
+        <w:rPr>
+          <w:rFonts w:hint="eastAsia"/>
+        </w:rPr>
+      </w:pPr>
+      <w:r>
+        <w:rPr>
+          <w:color w:val="B8B8B8"/>
+        </w:rPr>
+        <w:t>_______________________________________________________</w:t>
+      </w:r>
+    </w:p>
+    <w:p>
+      <w:pPr>
+        <w:rPr>
+          <w:rFonts w:hint="eastAsia"/>
+        </w:rPr>
+      </w:pPr>
+      <w:r>
+        <w:rPr>
+          <w:color w:val="B8B8B8"/>
+        </w:rPr>
+        <w:t>_______________________________________________________</w:t>
+      </w:r>
+    </w:p>
+    <w:p>
+      <w:pPr>
+        <w:rPr>
+          <w:rFonts w:hint="eastAsia"/>
+        </w:rPr>
+      </w:pPr>
+    </w:p>
+    <w:p>
+      <w:pPr>
+        <w:rPr>
+          <w:rFonts w:hint="eastAsia"/>
+        </w:rPr>
+      </w:pPr>
+      <w:r>
+        <w:rPr>
+          <w:i/>
+          <w:sz w:val="21"/>
+        </w:rPr>
+        <w:t>Was lebst du davon schon jetzt vor?</w:t>
+      </w:r>
+    </w:p>
+    <w:p>
+      <w:pPr>
+        <w:rPr>
+          <w:rFonts w:hint="eastAsia"/>
+        </w:rPr>
+      </w:pPr>
+      <w:r>
+        <w:rPr>
+          <w:color w:val="B8B8B8"/>
+        </w:rPr>
+        <w:t>_______________________________________________________</w:t>
+      </w:r>
+    </w:p>
+    <w:p>
+      <w:pPr>
+        <w:rPr>
+          <w:rFonts w:hint="eastAsia"/>
+        </w:rPr>
+      </w:pPr>
+      <w:r>
+        <w:rPr>
+          <w:color w:val="B8B8B8"/>
+        </w:rPr>
+        <w:t>_______________________________________________________</w:t>
+      </w:r>
+    </w:p>
+    <w:p>
+      <w:pPr>
+        <w:rPr>
+          <w:rFonts w:hint="eastAsia"/>
+        </w:rPr>
+      </w:pPr>
+    </w:p>
+    <w:p>
+      <w:pPr>
+        <w:rPr>
+          <w:rFonts w:hint="eastAsia"/>
+        </w:rPr>
+      </w:pPr>
+      <w:r>
+        <w:rPr>
+          <w:b/>
+          <w:color w:val="B9727E"/>
+        </w:rPr>
+        <w:t>Kleine Übung</w:t>
+      </w:r>
+    </w:p>
+    <w:p>
+      <w:pPr>
+        <w:rPr>
+          <w:rFonts w:hint="eastAsia"/>
+        </w:rPr>
+      </w:pPr>
+      <w:r>
+        <w:rPr>
+          <w:i/>
+          <w:sz w:val="21"/>
+        </w:rPr>
+        <w:t>Beschreib eine Situation, in der du bewusst etwas anderes vorleben willst.</w:t>
+      </w:r>
+    </w:p>
+    <w:p>
+      <w:pPr>
+        <w:rPr>
+          <w:rFonts w:hint="eastAsia"/>
+        </w:rPr>
+      </w:pPr>
+      <w:r>
+        <w:rPr>
+          <w:color w:val="B8B8B8"/>
+        </w:rPr>
+        <w:t>_______________________________________________________</w:t>
+      </w:r>
+    </w:p>
+    <w:p>
+      <w:pPr>
+        <w:rPr>
+          <w:rFonts w:hint="eastAsia"/>
+        </w:rPr>
+      </w:pPr>
+      <w:r>
+        <w:rPr>
+          <w:color w:val="B8B8B8"/>
+        </w:rPr>
+        <w:t>_______________________________________________________</w:t>
+      </w:r>
+    </w:p>
+    <w:p>
+      <w:pPr>
+        <w:rPr>
+          <w:rFonts w:hint="eastAsia"/>
+        </w:rPr>
+      </w:pPr>
+    </w:p>
+    <w:p>
+      <w:pPr>
+        <w:rPr>
+          <w:rFonts w:hint="eastAsia"/>
+        </w:rPr>
+      </w:pPr>
+      <w:r>
+        <w:rPr>
+          <w:b/>
+          <w:color w:val="2B2B2B"/>
+          <w:sz w:val="36"/>
+        </w:rPr>
+        <w:t>Kapitel 29. Der innere Kompass, den du schon hast</w:t>
+      </w:r>
+    </w:p>
+    <w:p>
+      <w:pPr>
+        <w:rPr>
+          <w:rFonts w:hint="eastAsia"/>
+        </w:rPr>
+      </w:pPr>
+      <w:r>
+        <w:rPr>
+          <w:i/>
+          <w:sz w:val="21"/>
+        </w:rPr>
+        <w:t>Die Fähigkeit, eigene Bedürfnisse zu spüren, ist angeboren, nicht neu zu erfinden.</w:t>
+      </w:r>
+    </w:p>
+    <w:p>
+      <w:pPr>
+        <w:rPr>
+          <w:rFonts w:hint="eastAsia"/>
+        </w:rPr>
+      </w:pPr>
+    </w:p>
+    <w:p>
+      <w:pPr>
+        <w:rPr>
+          <w:rFonts w:hint="eastAsia"/>
+        </w:rPr>
+      </w:pPr>
+      <w:r>
+        <w:rPr>
+          <w:b/>
+          <w:color w:val="B9727E"/>
+        </w:rPr>
+        <w:t>Zum Reflektieren</w:t>
+      </w:r>
+    </w:p>
+    <w:p>
+      <w:pPr>
+        <w:rPr>
+          <w:rFonts w:hint="eastAsia"/>
+        </w:rPr>
+      </w:pPr>
+      <w:r>
+        <w:rPr>
+          <w:i/>
+          <w:sz w:val="21"/>
+        </w:rPr>
+        <w:t>Wann hast du zuletzt gespürt, was dir wirklich guttut, ohne nachzudenken?</w:t>
+      </w:r>
+    </w:p>
+    <w:p>
+      <w:pPr>
+        <w:rPr>
+          <w:rFonts w:hint="eastAsia"/>
+        </w:rPr>
+      </w:pPr>
+      <w:r>
+        <w:rPr>
+          <w:color w:val="B8B8B8"/>
+        </w:rPr>
+        <w:t>_______________________________________________________</w:t>
+      </w:r>
+    </w:p>
+    <w:p>
+      <w:pPr>
+        <w:rPr>
+          <w:rFonts w:hint="eastAsia"/>
+        </w:rPr>
+      </w:pPr>
+      <w:r>
+        <w:rPr>
+          <w:color w:val="B8B8B8"/>
+        </w:rPr>
+        <w:t>_______________________________________________________</w:t>
+      </w:r>
+    </w:p>
+    <w:p>
+      <w:pPr>
+        <w:rPr>
+          <w:rFonts w:hint="eastAsia"/>
+        </w:rPr>
+      </w:pPr>
+    </w:p>
+    <w:p>
+      <w:pPr>
+        <w:rPr>
+          <w:rFonts w:hint="eastAsia"/>
+        </w:rPr>
+      </w:pPr>
+      <w:r>
+        <w:rPr>
+          <w:i/>
+          <w:sz w:val="21"/>
+        </w:rPr>
+        <w:t>Was hat diesen Moment möglich gemacht?</w:t>
+      </w:r>
+    </w:p>
+    <w:p>
+      <w:pPr>
+        <w:rPr>
+          <w:rFonts w:hint="eastAsia"/>
+        </w:rPr>
+      </w:pPr>
+      <w:r>
+        <w:rPr>
+          <w:color w:val="B8B8B8"/>
+        </w:rPr>
+        <w:t>_______________________________________________________</w:t>
+      </w:r>
+    </w:p>
+    <w:p>
+      <w:pPr>
+        <w:rPr>
+          <w:rFonts w:hint="eastAsia"/>
+        </w:rPr>
+      </w:pPr>
+      <w:r>
+        <w:rPr>
+          <w:color w:val="B8B8B8"/>
+        </w:rPr>
+        <w:t>_______________________________________________________</w:t>
+      </w:r>
+    </w:p>
+    <w:p>
+      <w:pPr>
+        <w:rPr>
+          <w:rFonts w:hint="eastAsia"/>
+        </w:rPr>
+      </w:pPr>
+    </w:p>
+    <w:p>
+      <w:pPr>
+        <w:rPr>
+          <w:rFonts w:hint="eastAsia"/>
+        </w:rPr>
+      </w:pPr>
+      <w:r>
+        <w:rPr>
+          <w:i/>
+          <w:sz w:val="21"/>
+        </w:rPr>
+        <w:t>Wie kannst du ihm diese Woche mehr Raum geben?</w:t>
+      </w:r>
+    </w:p>
+    <w:p>
+      <w:pPr>
+        <w:rPr>
+          <w:rFonts w:hint="eastAsia"/>
+        </w:rPr>
+      </w:pPr>
+      <w:r>
+        <w:rPr>
+          <w:color w:val="B8B8B8"/>
+        </w:rPr>
+        <w:t>_______________________________________________________</w:t>
+      </w:r>
+    </w:p>
+    <w:p>
+      <w:pPr>
+        <w:rPr>
+          <w:rFonts w:hint="eastAsia"/>
+        </w:rPr>
+      </w:pPr>
+      <w:r>
+        <w:rPr>
+          <w:color w:val="B8B8B8"/>
+        </w:rPr>
+        <w:t>_______________________________________________________</w:t>
+      </w:r>
+    </w:p>
+    <w:p>
+      <w:pPr>
+        <w:rPr>
+          <w:rFonts w:hint="eastAsia"/>
+        </w:rPr>
+      </w:pPr>
+    </w:p>
+    <w:p>
+      <w:pPr>
+        <w:rPr>
+          <w:rFonts w:hint="eastAsia"/>
+        </w:rPr>
+      </w:pPr>
+      <w:r>
+        <w:rPr>
+          <w:b/>
+          <w:color w:val="B9727E"/>
+        </w:rPr>
+        <w:t>Kleine Übung</w:t>
+      </w:r>
+    </w:p>
+    <w:p>
+      <w:pPr>
+        <w:rPr>
+          <w:rFonts w:hint="eastAsia"/>
+        </w:rPr>
+      </w:pPr>
+      <w:r>
+        <w:rPr>
+          <w:i/>
+          <w:sz w:val="21"/>
+        </w:rPr>
+        <w:t>Notiere einen Moment, in dem dein eigenes Gefühl klarer war, als du erwartet hast.</w:t>
+      </w:r>
+    </w:p>
+    <w:p>
+      <w:pPr>
+        <w:rPr>
+          <w:rFonts w:hint="eastAsia"/>
+        </w:rPr>
+      </w:pPr>
+      <w:r>
+        <w:rPr>
+          <w:color w:val="B8B8B8"/>
+        </w:rPr>
+        <w:t>_______________________________________________________</w:t>
+      </w:r>
+    </w:p>
+    <w:p>
+      <w:pPr>
+        <w:rPr>
+          <w:rFonts w:hint="eastAsia"/>
+        </w:rPr>
+      </w:pPr>
+      <w:r>
+        <w:rPr>
+          <w:color w:val="B8B8B8"/>
+        </w:rPr>
+        <w:t>_______________________________________________________</w:t>
+      </w:r>
+    </w:p>
+    <w:p>
+      <w:pPr>
+        <w:rPr>
+          <w:rFonts w:hint="eastAsia"/>
+        </w:rPr>
+      </w:pPr>
+    </w:p>
+    <w:p>
+      <w:pPr>
+        <w:rPr>
+          <w:rFonts w:hint="eastAsia"/>
+        </w:rPr>
+      </w:pPr>
+      <w:r>
+        <w:rPr>
+          <w:b/>
+          <w:color w:val="2B2B2B"/>
+          <w:sz w:val="36"/>
+        </w:rPr>
+        <w:t>Kapitel 30. Was du diesem Buch nicht schuldest</w:t>
+      </w:r>
+    </w:p>
+    <w:p>
+      <w:pPr>
+        <w:rPr>
+          <w:rFonts w:hint="eastAsia"/>
+        </w:rPr>
+      </w:pPr>
+      <w:r>
+        <w:rPr>
+          <w:i/>
+          <w:sz w:val="21"/>
+        </w:rPr>
+        <w:t>Du schuldest diesem Buch keine Dankbarkeit und keine perfekte Umsetzung.</w:t>
+      </w:r>
+    </w:p>
+    <w:p>
+      <w:pPr>
+        <w:rPr>
+          <w:rFonts w:hint="eastAsia"/>
+        </w:rPr>
+      </w:pPr>
+    </w:p>
+    <w:p>
+      <w:pPr>
+        <w:rPr>
+          <w:rFonts w:hint="eastAsia"/>
+        </w:rPr>
+      </w:pPr>
+      <w:r>
+        <w:rPr>
+          <w:b/>
+          <w:color w:val="B9727E"/>
+        </w:rPr>
+        <w:t>Zum Reflektieren</w:t>
+      </w:r>
+    </w:p>
+    <w:p>
+      <w:pPr>
+        <w:rPr>
+          <w:rFonts w:hint="eastAsia"/>
+        </w:rPr>
+      </w:pPr>
+      <w:r>
+        <w:rPr>
+          <w:i/>
+          <w:sz w:val="21"/>
+        </w:rPr>
+        <w:t>Welchen einen Satz nimmst du aus diesem Buch mit, wenn der Rest verblasst?</w:t>
+      </w:r>
+    </w:p>
+    <w:p>
+      <w:pPr>
+        <w:rPr>
+          <w:rFonts w:hint="eastAsia"/>
+        </w:rPr>
+      </w:pPr>
+      <w:r>
+        <w:rPr>
+          <w:color w:val="B8B8B8"/>
+        </w:rPr>
+        <w:t>_______________________________________________________</w:t>
+      </w:r>
+    </w:p>
+    <w:p>
+      <w:pPr>
+        <w:rPr>
+          <w:rFonts w:hint="eastAsia"/>
+        </w:rPr>
+      </w:pPr>
+      <w:r>
+        <w:rPr>
+          <w:color w:val="B8B8B8"/>
+        </w:rPr>
+        <w:t>_______________________________________________________</w:t>
+      </w:r>
+    </w:p>
+    <w:p>
+      <w:pPr>
+        <w:rPr>
+          <w:rFonts w:hint="eastAsia"/>
+        </w:rPr>
+      </w:pPr>
+    </w:p>
+    <w:p>
+      <w:pPr>
+        <w:rPr>
+          <w:rFonts w:hint="eastAsia"/>
+        </w:rPr>
+      </w:pPr>
+      <w:r>
+        <w:rPr>
+          <w:i/>
+          <w:sz w:val="21"/>
+        </w:rPr>
+        <w:t>Was erwartest du gerade unnötig streng von dir selbst?</w:t>
+      </w:r>
+    </w:p>
+    <w:p>
+      <w:pPr>
+        <w:rPr>
+          <w:rFonts w:hint="eastAsia"/>
+        </w:rPr>
+      </w:pPr>
+      <w:r>
+        <w:rPr>
+          <w:color w:val="B8B8B8"/>
+        </w:rPr>
+        <w:t>_______________________________________________________</w:t>
+      </w:r>
+    </w:p>
+    <w:p>
+      <w:pPr>
+        <w:rPr>
+          <w:rFonts w:hint="eastAsia"/>
+        </w:rPr>
+      </w:pPr>
+      <w:r>
+        <w:rPr>
+          <w:color w:val="B8B8B8"/>
+        </w:rPr>
+        <w:t>_______________________________________________________</w:t>
+      </w:r>
+    </w:p>
+    <w:p>
+      <w:pPr>
+        <w:rPr>
+          <w:rFonts w:hint="eastAsia"/>
+        </w:rPr>
+      </w:pPr>
+    </w:p>
+    <w:p>
+      <w:pPr>
+        <w:rPr>
+          <w:rFonts w:hint="eastAsia"/>
+        </w:rPr>
+      </w:pPr>
+      <w:r>
+        <w:rPr>
+          <w:i/>
+          <w:sz w:val="21"/>
+        </w:rPr>
+        <w:t>Wie würdest du mit einer Freundin sprechen, die das Gleiche durchmacht?</w:t>
+      </w:r>
+    </w:p>
+    <w:p>
+      <w:pPr>
+        <w:rPr>
+          <w:rFonts w:hint="eastAsia"/>
+        </w:rPr>
+      </w:pPr>
+      <w:r>
+        <w:rPr>
+          <w:color w:val="B8B8B8"/>
+        </w:rPr>
+        <w:t>_______________________________________________________</w:t>
+      </w:r>
+    </w:p>
+    <w:p>
+      <w:pPr>
+        <w:rPr>
+          <w:rFonts w:hint="eastAsia"/>
+        </w:rPr>
+      </w:pPr>
+      <w:r>
+        <w:rPr>
+          <w:color w:val="B8B8B8"/>
+        </w:rPr>
+        <w:t>_______________________________________________________</w:t>
+      </w:r>
+    </w:p>
+    <w:p>
+      <w:pPr>
+        <w:rPr>
+          <w:rFonts w:hint="eastAsia"/>
+        </w:rPr>
+      </w:pPr>
+    </w:p>
+    <w:p>
+      <w:pPr>
+        <w:rPr>
+          <w:rFonts w:hint="eastAsia"/>
+        </w:rPr>
+      </w:pPr>
+      <w:r>
+        <w:rPr>
+          <w:b/>
+          <w:color w:val="B9727E"/>
+        </w:rPr>
+        <w:t>Kleine Übung</w:t>
+      </w:r>
+    </w:p>
+    <w:p>
+      <w:pPr>
+        <w:rPr>
+          <w:rFonts w:hint="eastAsia"/>
+        </w:rPr>
+      </w:pPr>
+      <w:r>
+        <w:rPr>
+          <w:i/>
+          <w:sz w:val="21"/>
+        </w:rPr>
+        <w:t>Schreib dir den einen Satz auf, der wirklich angekommen ist.</w:t>
+      </w:r>
+    </w:p>
+    <w:p>
+      <w:pPr>
+        <w:rPr>
+          <w:rFonts w:hint="eastAsia"/>
+        </w:rPr>
+      </w:pPr>
+      <w:r>
+        <w:rPr>
+          <w:color w:val="B8B8B8"/>
+        </w:rPr>
+        <w:t>_______________________________________________________</w:t>
+      </w:r>
+    </w:p>
+    <w:p>
+      <w:pPr>
+        <w:rPr>
+          <w:rFonts w:hint="eastAsia"/>
+        </w:rPr>
+      </w:pPr>
+      <w:r>
+        <w:rPr>
+          <w:color w:val="B8B8B8"/>
+        </w:rPr>
+        <w:t>_______________________________________________________</w:t>
+      </w:r>
+    </w:p>
+    <w:p>
+      <w:pPr>
+        <w:rPr>
+          <w:rFonts w:hint="eastAsia"/>
+        </w:rPr>
+      </w:pPr>
+    </w:p>
+    <w:p>
+      <w:pPr>
+        <w:rPr>
+          <w:rFonts w:hint="eastAsia"/>
+        </w:rPr>
+      </w:pPr>
+      <w:r>
+        <w:rPr>
+          <w:b/>
+          <w:color w:val="2B2B2B"/>
+          <w:sz w:val="36"/>
+        </w:rPr>
+        <w:t>Kapitel 31. Ein letzter Gedanke, bevor du weiterliest</w:t>
+      </w:r>
+    </w:p>
+    <w:p>
+      <w:pPr>
+        <w:rPr>
+          <w:rFonts w:hint="eastAsia"/>
+        </w:rPr>
+      </w:pPr>
+      <w:r>
+        <w:rPr>
+          <w:i/>
+          <w:sz w:val="21"/>
+        </w:rPr>
+        <w:t>Was du gelesen hast, verschwindet nicht wieder. Es liegt jetzt da, wo du es findest.</w:t>
+      </w:r>
+    </w:p>
+    <w:p>
+      <w:pPr>
+        <w:rPr>
+          <w:rFonts w:hint="eastAsia"/>
+        </w:rPr>
+      </w:pPr>
+    </w:p>
+    <w:p>
+      <w:pPr>
+        <w:rPr>
+          <w:rFonts w:hint="eastAsia"/>
+        </w:rPr>
+      </w:pPr>
+      <w:r>
+        <w:rPr>
+          <w:b/>
+          <w:color w:val="B9727E"/>
+        </w:rPr>
+        <w:t>Zum Reflektieren</w:t>
+      </w:r>
+    </w:p>
+    <w:p>
+      <w:pPr>
+        <w:rPr>
+          <w:rFonts w:hint="eastAsia"/>
+        </w:rPr>
+      </w:pPr>
+      <w:r>
+        <w:rPr>
+          <w:i/>
+          <w:sz w:val="21"/>
+        </w:rPr>
+        <w:t>Wie bist du zu diesem Buch gekommen?</w:t>
+      </w:r>
+    </w:p>
+    <w:p>
+      <w:pPr>
+        <w:rPr>
+          <w:rFonts w:hint="eastAsia"/>
+        </w:rPr>
+      </w:pPr>
+      <w:r>
+        <w:rPr>
+          <w:color w:val="B8B8B8"/>
+        </w:rPr>
+        <w:t>_______________________________________________________</w:t>
+      </w:r>
+    </w:p>
+    <w:p>
+      <w:pPr>
+        <w:rPr>
+          <w:rFonts w:hint="eastAsia"/>
+        </w:rPr>
+      </w:pPr>
+      <w:r>
+        <w:rPr>
+          <w:color w:val="B8B8B8"/>
+        </w:rPr>
+        <w:t>_______________________________________________________</w:t>
+      </w:r>
+    </w:p>
+    <w:p>
+      <w:pPr>
+        <w:rPr>
+          <w:rFonts w:hint="eastAsia"/>
+        </w:rPr>
+      </w:pPr>
+    </w:p>
+    <w:p>
+      <w:pPr>
+        <w:rPr>
+          <w:rFonts w:hint="eastAsia"/>
+        </w:rPr>
+      </w:pPr>
+      <w:r>
+        <w:rPr>
+          <w:i/>
+          <w:sz w:val="21"/>
+        </w:rPr>
+        <w:t>Was hat sich seit dem ersten Kapitel am meisten verändert?</w:t>
+      </w:r>
+    </w:p>
+    <w:p>
+      <w:pPr>
+        <w:rPr>
+          <w:rFonts w:hint="eastAsia"/>
+        </w:rPr>
+      </w:pPr>
+      <w:r>
+        <w:rPr>
+          <w:color w:val="B8B8B8"/>
+        </w:rPr>
+        <w:t>_______________________________________________________</w:t>
+      </w:r>
+    </w:p>
+    <w:p>
+      <w:pPr>
+        <w:rPr>
+          <w:rFonts w:hint="eastAsia"/>
+        </w:rPr>
+      </w:pPr>
+      <w:r>
+        <w:rPr>
+          <w:color w:val="B8B8B8"/>
+        </w:rPr>
+        <w:t>_______________________________________________________</w:t>
+      </w:r>
+    </w:p>
+    <w:p>
+      <w:pPr>
+        <w:rPr>
+          <w:rFonts w:hint="eastAsia"/>
+        </w:rPr>
+      </w:pPr>
+    </w:p>
+    <w:p>
+      <w:pPr>
+        <w:rPr>
+          <w:rFonts w:hint="eastAsia"/>
+        </w:rPr>
+      </w:pPr>
+      <w:r>
+        <w:rPr>
+          <w:i/>
+          <w:sz w:val="21"/>
+        </w:rPr>
+        <w:t>Was nimmst du dir jetzt vor, ganz konkret?</w:t>
+      </w:r>
+    </w:p>
+    <w:p>
+      <w:pPr>
+        <w:rPr>
+          <w:rFonts w:hint="eastAsia"/>
+        </w:rPr>
+      </w:pPr>
+      <w:r>
+        <w:rPr>
+          <w:color w:val="B8B8B8"/>
+        </w:rPr>
+        <w:t>_______________________________________________________</w:t>
+      </w:r>
+    </w:p>
+    <w:p>
+      <w:pPr>
+        <w:rPr>
+          <w:rFonts w:hint="eastAsia"/>
+        </w:rPr>
+      </w:pPr>
+      <w:r>
+        <w:rPr>
+          <w:color w:val="B8B8B8"/>
+        </w:rPr>
+        <w:t>_______________________________________________________</w:t>
+      </w:r>
+    </w:p>
+    <w:p>
+      <w:pPr>
+        <w:rPr>
+          <w:rFonts w:hint="eastAsia"/>
+        </w:rPr>
+      </w:pPr>
+    </w:p>
+    <w:p>
+      <w:pPr>
+        <w:rPr>
+          <w:rFonts w:hint="eastAsia"/>
+        </w:rPr>
+      </w:pPr>
+      <w:r>
+        <w:rPr>
+          <w:b/>
+          <w:color w:val="B9727E"/>
+        </w:rPr>
+        <w:t>Kleine Übung</w:t>
+      </w:r>
+    </w:p>
+    <w:p>
+      <w:pPr>
+        <w:rPr>
+          <w:rFonts w:hint="eastAsia"/>
+        </w:rPr>
+      </w:pPr>
+      <w:r>
+        <w:rPr>
+          <w:i/>
+          <w:sz w:val="21"/>
+        </w:rPr>
+        <w:t>Schreib einen kurzen Brief an die Person, die du warst, bevor du angefangen hast.</w:t>
+      </w:r>
+    </w:p>
+    <w:p>
+      <w:pPr>
+        <w:rPr>
+          <w:rFonts w:hint="eastAsia"/>
+        </w:rPr>
+      </w:pPr>
+      <w:r>
+        <w:rPr>
+          <w:color w:val="B8B8B8"/>
+        </w:rPr>
+        <w:t>_______________________________________________________</w:t>
+      </w:r>
+    </w:p>
+    <w:p>
+      <w:pPr>
+        <w:rPr>
+          <w:rFonts w:hint="eastAsia"/>
+        </w:rPr>
+      </w:pPr>
+      <w:r>
+        <w:rPr>
+          <w:color w:val="B8B8B8"/>
+        </w:rPr>
+        <w:t>_______________________________________________________</w:t>
+      </w:r>
+    </w:p>
+    <w:p>
+      <w:pPr>
+        <w:rPr>
+          <w:rFonts w:hint="eastAsia"/>
+        </w:rPr>
+      </w:pPr>
+    </w:p>
+    <w:p>
+      <w:pPr>
+        <w:rPr>
+          <w:rFonts w:hint="eastAsia"/>
+        </w:rPr>
+      </w:pPr>
+      <w:r>
+        <w:rPr>
+          <w:b/>
+          <w:color w:val="2B2B2B"/>
+          <w:sz w:val="36"/>
+        </w:rPr>
+        <w:t>Kapitel 32. Wenn du dieses Buch verschenkst</w:t>
+      </w:r>
+    </w:p>
+    <w:p>
+      <w:pPr>
+        <w:rPr>
+          <w:rFonts w:hint="eastAsia"/>
+        </w:rPr>
+      </w:pPr>
+      <w:r>
+        <w:rPr>
+          <w:i/>
+          <w:sz w:val="21"/>
+        </w:rPr>
+        <w:t>Am stärksten wirkt es, wenn die Person selbst danach gesucht hat.</w:t>
+      </w:r>
+    </w:p>
+    <w:p>
+      <w:pPr>
+        <w:rPr>
+          <w:rFonts w:hint="eastAsia"/>
+        </w:rPr>
+      </w:pPr>
+    </w:p>
+    <w:p>
+      <w:pPr>
+        <w:rPr>
+          <w:rFonts w:hint="eastAsia"/>
+        </w:rPr>
+      </w:pPr>
+      <w:r>
+        <w:rPr>
+          <w:b/>
+          <w:color w:val="B9727E"/>
+        </w:rPr>
+        <w:t>Zum Reflektieren</w:t>
+      </w:r>
+    </w:p>
+    <w:p>
+      <w:pPr>
+        <w:rPr>
+          <w:rFonts w:hint="eastAsia"/>
+        </w:rPr>
+      </w:pPr>
+      <w:r>
+        <w:rPr>
+          <w:i/>
+          <w:sz w:val="21"/>
+        </w:rPr>
+        <w:t>Wem würdest du dieses Buch gerne geben?</w:t>
+      </w:r>
+    </w:p>
+    <w:p>
+      <w:pPr>
+        <w:rPr>
+          <w:rFonts w:hint="eastAsia"/>
+        </w:rPr>
+      </w:pPr>
+      <w:r>
+        <w:rPr>
+          <w:color w:val="B8B8B8"/>
+        </w:rPr>
+        <w:t>_______________________________________________________</w:t>
+      </w:r>
+    </w:p>
+    <w:p>
+      <w:pPr>
+        <w:rPr>
+          <w:rFonts w:hint="eastAsia"/>
+        </w:rPr>
+      </w:pPr>
+      <w:r>
+        <w:rPr>
+          <w:color w:val="B8B8B8"/>
+        </w:rPr>
+        <w:t>_______________________________________________________</w:t>
+      </w:r>
+    </w:p>
+    <w:p>
+      <w:pPr>
+        <w:rPr>
+          <w:rFonts w:hint="eastAsia"/>
+        </w:rPr>
+      </w:pPr>
+    </w:p>
+    <w:p>
+      <w:pPr>
+        <w:rPr>
+          <w:rFonts w:hint="eastAsia"/>
+        </w:rPr>
+      </w:pPr>
+      <w:r>
+        <w:rPr>
+          <w:i/>
+          <w:sz w:val="21"/>
+        </w:rPr>
+        <w:t>Was würdest du dieser Person stattdessen einfach erzählen?</w:t>
+      </w:r>
+    </w:p>
+    <w:p>
+      <w:pPr>
+        <w:rPr>
+          <w:rFonts w:hint="eastAsia"/>
+        </w:rPr>
+      </w:pPr>
+      <w:r>
+        <w:rPr>
+          <w:color w:val="B8B8B8"/>
+        </w:rPr>
+        <w:t>_______________________________________________________</w:t>
+      </w:r>
+    </w:p>
+    <w:p>
+      <w:pPr>
+        <w:rPr>
+          <w:rFonts w:hint="eastAsia"/>
+        </w:rPr>
+      </w:pPr>
+      <w:r>
+        <w:rPr>
+          <w:color w:val="B8B8B8"/>
+        </w:rPr>
+        <w:t>_______________________________________________________</w:t>
+      </w:r>
+    </w:p>
+    <w:p>
+      <w:pPr>
+        <w:rPr>
+          <w:rFonts w:hint="eastAsia"/>
+        </w:rPr>
+      </w:pPr>
+    </w:p>
+    <w:p>
+      <w:pPr>
+        <w:rPr>
+          <w:rFonts w:hint="eastAsia"/>
+        </w:rPr>
+      </w:pPr>
+      <w:r>
+        <w:rPr>
+          <w:i/>
+          <w:sz w:val="21"/>
+        </w:rPr>
+        <w:t>Wie lässt du ihr die Entscheidung, ob sie es lesen will?</w:t>
+      </w:r>
+    </w:p>
+    <w:p>
+      <w:pPr>
+        <w:rPr>
+          <w:rFonts w:hint="eastAsia"/>
+        </w:rPr>
+      </w:pPr>
+      <w:r>
+        <w:rPr>
+          <w:color w:val="B8B8B8"/>
+        </w:rPr>
+        <w:t>_______________________________________________________</w:t>
+      </w:r>
+    </w:p>
+    <w:p>
+      <w:pPr>
+        <w:rPr>
+          <w:rFonts w:hint="eastAsia"/>
+        </w:rPr>
+      </w:pPr>
+      <w:r>
+        <w:rPr>
+          <w:color w:val="B8B8B8"/>
+        </w:rPr>
+        <w:t>_______________________________________________________</w:t>
+      </w:r>
+    </w:p>
+    <w:p>
+      <w:pPr>
+        <w:rPr>
+          <w:rFonts w:hint="eastAsia"/>
+        </w:rPr>
+      </w:pPr>
+    </w:p>
+    <w:p>
+      <w:pPr>
+        <w:rPr>
+          <w:rFonts w:hint="eastAsia"/>
+        </w:rPr>
+      </w:pPr>
+      <w:r>
+        <w:rPr>
+          <w:b/>
+          <w:color w:val="B9727E"/>
+        </w:rPr>
+        <w:t>Kleine Übung</w:t>
+      </w:r>
+    </w:p>
+    <w:p>
+      <w:pPr>
+        <w:rPr>
+          <w:rFonts w:hint="eastAsia"/>
+        </w:rPr>
+      </w:pPr>
+      <w:r>
+        <w:rPr>
+          <w:i/>
+          <w:sz w:val="21"/>
+        </w:rPr>
+        <w:t>Formuliere den einen Satz, mit dem du das Buch weitergeben würdest.</w:t>
+      </w:r>
+    </w:p>
+    <w:p>
+      <w:pPr>
+        <w:rPr>
+          <w:rFonts w:hint="eastAsia"/>
+        </w:rPr>
+      </w:pPr>
+      <w:r>
+        <w:rPr>
+          <w:color w:val="B8B8B8"/>
+        </w:rPr>
+        <w:t>_______________________________________________________</w:t>
+      </w:r>
+    </w:p>
+    <w:p>
+      <w:pPr>
+        <w:rPr>
+          <w:rFonts w:hint="eastAsia"/>
+        </w:rPr>
+      </w:pPr>
+      <w:r>
+        <w:rPr>
+          <w:color w:val="B8B8B8"/>
+        </w:rPr>
+        <w:t>_______________________________________________________</w:t>
+      </w:r>
+    </w:p>
+    <w:p>
+      <w:pPr>
+        <w:rPr>
+          <w:rFonts w:hint="eastAsia"/>
+        </w:rPr>
+      </w:pPr>
+    </w:p>
+    <w:p>
+      <w:pPr>
+        <w:rPr>
+          <w:rFonts w:hint="eastAsia"/>
+        </w:rPr>
+      </w:pPr>
+      <w:r>
+        <w:rPr>
+          <w:b/>
+          <w:color w:val="2B2B2B"/>
+          <w:sz w:val="36"/>
+        </w:rPr>
+        <w:t>Kapitel 33. Zum Schluss: ein Wort über Geduld</w:t>
+      </w:r>
+    </w:p>
+    <w:p>
+      <w:pPr>
+        <w:rPr>
+          <w:rFonts w:hint="eastAsia"/>
+        </w:rPr>
+      </w:pPr>
+      <w:r>
+        <w:rPr>
+          <w:i/>
+          <w:sz w:val="21"/>
+        </w:rPr>
+        <w:t>Ein Muster, das über Jahrzehnte gewachsen ist, darf sich in Ruhe wieder verändern.</w:t>
+      </w:r>
+    </w:p>
+    <w:p>
+      <w:pPr>
+        <w:rPr>
+          <w:rFonts w:hint="eastAsia"/>
+        </w:rPr>
+      </w:pPr>
+    </w:p>
+    <w:p>
+      <w:pPr>
+        <w:rPr>
+          <w:rFonts w:hint="eastAsia"/>
+        </w:rPr>
+      </w:pPr>
+      <w:r>
+        <w:rPr>
+          <w:b/>
+          <w:color w:val="B9727E"/>
+        </w:rPr>
+        <w:t>Zum Reflektieren</w:t>
+      </w:r>
+    </w:p>
+    <w:p>
+      <w:pPr>
+        <w:rPr>
+          <w:rFonts w:hint="eastAsia"/>
+        </w:rPr>
+      </w:pPr>
+      <w:r>
+        <w:rPr>
+          <w:i/>
+          <w:sz w:val="21"/>
+        </w:rPr>
+        <w:t>Wo warst du in letzter Zeit ungeduldig mit dir selbst?</w:t>
+      </w:r>
+    </w:p>
+    <w:p>
+      <w:pPr>
+        <w:rPr>
+          <w:rFonts w:hint="eastAsia"/>
+        </w:rPr>
+      </w:pPr>
+      <w:r>
+        <w:rPr>
+          <w:color w:val="B8B8B8"/>
+        </w:rPr>
+        <w:t>_______________________________________________________</w:t>
+      </w:r>
+    </w:p>
+    <w:p>
+      <w:pPr>
+        <w:rPr>
+          <w:rFonts w:hint="eastAsia"/>
+        </w:rPr>
+      </w:pPr>
+      <w:r>
+        <w:rPr>
+          <w:color w:val="B8B8B8"/>
+        </w:rPr>
+        <w:t>_______________________________________________________</w:t>
+      </w:r>
+    </w:p>
+    <w:p>
+      <w:pPr>
+        <w:rPr>
+          <w:rFonts w:hint="eastAsia"/>
+        </w:rPr>
+      </w:pPr>
+    </w:p>
+    <w:p>
+      <w:pPr>
+        <w:rPr>
+          <w:rFonts w:hint="eastAsia"/>
+        </w:rPr>
+      </w:pPr>
+      <w:r>
+        <w:rPr>
+          <w:i/>
+          <w:sz w:val="21"/>
+        </w:rPr>
+        <w:t>Was würde sich ändern, wenn du dir mehr Zeit gibst?</w:t>
+      </w:r>
+    </w:p>
+    <w:p>
+      <w:pPr>
+        <w:rPr>
+          <w:rFonts w:hint="eastAsia"/>
+        </w:rPr>
+      </w:pPr>
+      <w:r>
+        <w:rPr>
+          <w:color w:val="B8B8B8"/>
+        </w:rPr>
+        <w:t>_______________________________________________________</w:t>
+      </w:r>
+    </w:p>
+    <w:p>
+      <w:pPr>
+        <w:rPr>
+          <w:rFonts w:hint="eastAsia"/>
+        </w:rPr>
+      </w:pPr>
+      <w:r>
+        <w:rPr>
+          <w:color w:val="B8B8B8"/>
+        </w:rPr>
+        <w:t>_______________________________________________________</w:t>
+      </w:r>
+    </w:p>
+    <w:p>
+      <w:pPr>
+        <w:rPr>
+          <w:rFonts w:hint="eastAsia"/>
+        </w:rPr>
+      </w:pPr>
+    </w:p>
+    <w:p>
+      <w:pPr>
+        <w:rPr>
+          <w:rFonts w:hint="eastAsia"/>
+        </w:rPr>
+      </w:pPr>
+      <w:r>
+        <w:rPr>
+          <w:i/>
+          <w:sz w:val="21"/>
+        </w:rPr>
+        <w:t>Was ist der nächste kleine Schritt, ohne Zeitdruck?</w:t>
+      </w:r>
+    </w:p>
+    <w:p>
+      <w:pPr>
+        <w:rPr>
+          <w:rFonts w:hint="eastAsia"/>
+        </w:rPr>
+      </w:pPr>
+      <w:r>
+        <w:rPr>
+          <w:color w:val="B8B8B8"/>
+        </w:rPr>
+        <w:t>_______________________________________________________</w:t>
+      </w:r>
+    </w:p>
+    <w:p>
+      <w:pPr>
+        <w:rPr>
+          <w:rFonts w:hint="eastAsia"/>
+        </w:rPr>
+      </w:pPr>
+      <w:r>
+        <w:rPr>
+          <w:color w:val="B8B8B8"/>
+        </w:rPr>
+        <w:t>_______________________________________________________</w:t>
+      </w:r>
+    </w:p>
+    <w:p>
+      <w:pPr>
+        <w:rPr>
+          <w:rFonts w:hint="eastAsia"/>
+        </w:rPr>
+      </w:pPr>
+    </w:p>
+    <w:p>
+      <w:pPr>
+        <w:rPr>
+          <w:rFonts w:hint="eastAsia"/>
+        </w:rPr>
+      </w:pPr>
+      <w:r>
+        <w:rPr>
+          <w:b/>
+          <w:color w:val="B9727E"/>
+        </w:rPr>
+        <w:t>Kleine Übung</w:t>
+      </w:r>
+    </w:p>
+    <w:p>
+      <w:pPr>
+        <w:rPr>
+          <w:rFonts w:hint="eastAsia"/>
+        </w:rPr>
+      </w:pPr>
+      <w:r>
+        <w:rPr>
+          <w:i/>
+          <w:sz w:val="21"/>
+        </w:rPr>
+        <w:t>Schreib auf, was Geduld mit dir selbst diese Woche konkret bedeuten könnte.</w:t>
+      </w:r>
+    </w:p>
+    <w:p>
+      <w:pPr>
+        <w:rPr>
+          <w:rFonts w:hint="eastAsia"/>
+        </w:rPr>
+      </w:pPr>
+      <w:r>
+        <w:rPr>
+          <w:color w:val="B8B8B8"/>
+        </w:rPr>
+        <w:t>_______________________________________________________</w:t>
+      </w:r>
+    </w:p>
+    <w:p>
+      <w:pPr>
+        <w:rPr>
+          <w:rFonts w:hint="eastAsia"/>
+        </w:rPr>
+      </w:pPr>
+      <w:r>
+        <w:rPr>
+          <w:color w:val="B8B8B8"/>
+        </w:rPr>
+        <w:t>_______________________________________________________</w:t>
+      </w:r>
+    </w:p>
+    <w:p>
+      <w:pPr>
+        <w:rPr>
+          <w:rFonts w:hint="eastAsia"/>
+        </w:rPr>
+      </w:pPr>
     </w:p>
     <w:p>
       <w:pPr>

</xml_diff>